<commit_message>
Update additional requirements KB for selling country
</commit_message>
<xml_diff>
--- a/docs/additional_requirements_nda_kb.docx
+++ b/docs/additional_requirements_nda_kb.docx
@@ -1321,7 +1321,7 @@
           <w:rFonts w:ascii="Arial" w:hAnsi="Arial"/>
           <w:sz w:val="20"/>
         </w:rPr>
-        <w:t>The applicable country is Australia or New Zealand, either from metadata or explicit document evidence.</w:t>
+        <w:t>The Selling Country is Australia or New Zealand, either from metadata or explicit document evidence.</w:t>
       </w:r>
     </w:p>
     <w:p>
@@ -1354,6 +1354,74 @@
     </w:p>
     <w:p>
       <w:pPr>
+        <w:pStyle w:val="ListNumber"/>
+        <w:numPr>
+          <w:ilvl w:val="0"/>
+          <w:numId w:val="0"/>
+        </w:numPr>
+      </w:pPr>
+    </w:p>
+    <w:p>
+      <w:pPr>
+        <w:pStyle w:val="ListNumber"/>
+        <w:numPr>
+          <w:ilvl w:val="0"/>
+          <w:numId w:val="0"/>
+        </w:numPr>
+        <w:rPr>
+          <w:rFonts w:ascii="Arial" w:hAnsi="Arial" w:cs="Arial"/>
+          <w:sz w:val="20"/>
+          <w:szCs w:val="20"/>
+        </w:rPr>
+      </w:pPr>
+      <w:r>
+        <w:rPr>
+          <w:rFonts w:ascii="Arial" w:hAnsi="Arial" w:cs="Arial"/>
+          <w:sz w:val="20"/>
+          <w:szCs w:val="20"/>
+        </w:rPr>
+        <w:lastRenderedPageBreak/>
+        <w:t>If Selling Country metadata is provided and the value is not Australia or New Zealand, this requirement MUST NOT trigger regardless of deed-related language.</w:t>
+      </w:r>
+    </w:p>
+    <w:p>
+      <w:pPr>
+        <w:pStyle w:val="ListNumber"/>
+        <w:numPr>
+          <w:ilvl w:val="0"/>
+          <w:numId w:val="0"/>
+        </w:numPr>
+        <w:rPr>
+          <w:rFonts w:ascii="Arial" w:hAnsi="Arial" w:cs="Arial"/>
+          <w:sz w:val="20"/>
+          <w:szCs w:val="20"/>
+        </w:rPr>
+      </w:pPr>
+    </w:p>
+    <w:p>
+      <w:pPr>
+        <w:pStyle w:val="ListNumber"/>
+        <w:numPr>
+          <w:ilvl w:val="0"/>
+          <w:numId w:val="0"/>
+        </w:numPr>
+        <w:rPr>
+          <w:rFonts w:ascii="Arial" w:hAnsi="Arial" w:cs="Arial"/>
+          <w:sz w:val="20"/>
+          <w:szCs w:val="20"/>
+        </w:rPr>
+      </w:pPr>
+      <w:r>
+        <w:rPr>
+          <w:rFonts w:ascii="Arial" w:hAnsi="Arial" w:cs="Arial"/>
+          <w:sz w:val="20"/>
+          <w:szCs w:val="20"/>
+        </w:rPr>
+        <w:t>If Selling Country metadata is provided, Selling Country metadata takes precedence over inferred country information from the NDA text.</w:t>
+      </w:r>
+    </w:p>
+    <w:p>
+      <w:pPr>
         <w:pStyle w:val="Heading2"/>
       </w:pPr>
       <w:r>
@@ -1385,8 +1453,404 @@
           <w:rFonts w:ascii="Arial" w:hAnsi="Arial"/>
           <w:sz w:val="20"/>
         </w:rPr>
+        <w:t>deed of confidentiality</w:t>
+      </w:r>
+    </w:p>
+    <w:p>
+      <w:pPr>
+        <w:pStyle w:val="ListBullet"/>
+      </w:pPr>
+      <w:r>
+        <w:rPr>
+          <w:rFonts w:ascii="Arial" w:hAnsi="Arial"/>
+          <w:sz w:val="20"/>
+        </w:rPr>
+        <w:t>mutual confidentiality deed</w:t>
+      </w:r>
+    </w:p>
+    <w:p>
+      <w:pPr>
+        <w:pStyle w:val="ListBullet"/>
+      </w:pPr>
+      <w:r>
+        <w:rPr>
+          <w:rFonts w:ascii="Arial" w:hAnsi="Arial"/>
+          <w:sz w:val="20"/>
+        </w:rPr>
+        <w:t>signed, sealed and delivered</w:t>
+      </w:r>
+    </w:p>
+    <w:p>
+      <w:pPr>
+        <w:pStyle w:val="ListBullet"/>
+      </w:pPr>
+      <w:r>
+        <w:rPr>
+          <w:rFonts w:ascii="Arial" w:hAnsi="Arial"/>
+          <w:sz w:val="20"/>
+        </w:rPr>
+        <w:t>witness requirements tied to deed execution</w:t>
+      </w:r>
+    </w:p>
+    <w:p>
+      <w:pPr>
+        <w:pStyle w:val="Heading2"/>
+      </w:pPr>
+      <w:r>
+        <w:rPr>
+          <w:rFonts w:ascii="Arial" w:hAnsi="Arial"/>
+          <w:sz w:val="20"/>
+        </w:rPr>
+        <w:t>Do Not Trigger</w:t>
+      </w:r>
+    </w:p>
+    <w:p>
+      <w:r>
+        <w:rPr>
+          <w:rFonts w:ascii="Arial" w:hAnsi="Arial"/>
+          <w:sz w:val="20"/>
+        </w:rPr>
+        <w:t>Do not trigger this requirement when:</w:t>
+      </w:r>
+    </w:p>
+    <w:p>
+      <w:pPr>
+        <w:pStyle w:val="ListBullet"/>
+      </w:pPr>
+      <w:r>
+        <w:rPr>
+          <w:rFonts w:ascii="Arial" w:hAnsi="Arial"/>
+          <w:sz w:val="20"/>
+        </w:rPr>
+        <w:t>Only generic signature language exists.</w:t>
+      </w:r>
+    </w:p>
+    <w:p>
+      <w:pPr>
+        <w:pStyle w:val="ListBullet"/>
+      </w:pPr>
+      <w:r>
+        <w:rPr>
+          <w:rFonts w:ascii="Arial" w:hAnsi="Arial"/>
+          <w:sz w:val="20"/>
+        </w:rPr>
+        <w:t>Only counterpart or electronic signature language exists.</w:t>
+      </w:r>
+    </w:p>
+    <w:p>
+      <w:pPr>
+        <w:pStyle w:val="ListBullet"/>
+      </w:pPr>
+      <w:r>
+        <w:rPr>
+          <w:rFonts w:ascii="Arial" w:hAnsi="Arial"/>
+          <w:sz w:val="20"/>
+        </w:rPr>
+        <w:t>The applicable country is not Australia or New Zealand.</w:t>
+      </w:r>
+    </w:p>
+    <w:p>
+      <w:pPr>
+        <w:pStyle w:val="ListBullet"/>
+      </w:pPr>
+      <w:r>
+        <w:rPr>
+          <w:rFonts w:ascii="Arial" w:hAnsi="Arial"/>
+          <w:sz w:val="20"/>
+        </w:rPr>
+        <w:t>Country evidence is missing or conflicting.</w:t>
+      </w:r>
+    </w:p>
+    <w:p>
+      <w:pPr>
+        <w:pStyle w:val="ListBullet"/>
+        <w:rPr>
+          <w:rFonts w:ascii="Arial" w:hAnsi="Arial" w:cs="Arial"/>
+          <w:sz w:val="20"/>
+          <w:szCs w:val="20"/>
+        </w:rPr>
+      </w:pPr>
+      <w:r>
+        <w:rPr>
+          <w:rFonts w:ascii="Arial" w:hAnsi="Arial" w:cs="Arial"/>
+          <w:sz w:val="20"/>
+          <w:szCs w:val="20"/>
+        </w:rPr>
+        <w:t>Selling Country metadata is provided and is not Australia or New Zealand.</w:t>
+      </w:r>
+    </w:p>
+    <w:p>
+      <w:pPr>
+        <w:pStyle w:val="ListBullet"/>
+        <w:numPr>
+          <w:ilvl w:val="0"/>
+          <w:numId w:val="0"/>
+        </w:numPr>
+        <w:ind w:left="360"/>
+      </w:pPr>
+    </w:p>
+    <w:p>
+      <w:pPr>
+        <w:pStyle w:val="Heading2"/>
+      </w:pPr>
+      <w:r>
+        <w:rPr>
+          <w:rFonts w:ascii="Arial" w:hAnsi="Arial"/>
+          <w:sz w:val="20"/>
+        </w:rPr>
+        <w:t>Static Display Text</w:t>
+      </w:r>
+    </w:p>
+    <w:p>
+      <w:r>
+        <w:rPr>
+          <w:rFonts w:ascii="Arial" w:hAnsi="Arial"/>
+          <w:sz w:val="20"/>
+        </w:rPr>
+        <w:t xml:space="preserve">This NDA requires </w:t>
+      </w:r>
+      <w:proofErr w:type="gramStart"/>
+      <w:r>
+        <w:rPr>
+          <w:rFonts w:ascii="Arial" w:hAnsi="Arial"/>
+          <w:sz w:val="20"/>
+        </w:rPr>
+        <w:t>signature</w:t>
+      </w:r>
+      <w:proofErr w:type="gramEnd"/>
+      <w:r>
+        <w:rPr>
+          <w:rFonts w:ascii="Arial" w:hAnsi="Arial"/>
+          <w:sz w:val="20"/>
+        </w:rPr>
+        <w:t xml:space="preserve"> by deed and requires legal support for processing.</w:t>
+      </w:r>
+    </w:p>
+    <w:p>
+      <w:pPr>
+        <w:pStyle w:val="Heading1"/>
+      </w:pPr>
+      <w:r>
+        <w:rPr>
+          <w:rFonts w:ascii="Arial" w:hAnsi="Arial"/>
+          <w:sz w:val="20"/>
+        </w:rPr>
+        <w:t>6. Requirement 4: Insider Trading (For Contracting in Italy)</w:t>
+      </w:r>
+    </w:p>
+    <w:p>
+      <w:pPr>
+        <w:pStyle w:val="Heading2"/>
+      </w:pPr>
+      <w:proofErr w:type="spellStart"/>
+      <w:r>
+        <w:rPr>
+          <w:rFonts w:ascii="Arial" w:hAnsi="Arial"/>
+          <w:sz w:val="20"/>
+        </w:rPr>
+        <w:t>RiskID</w:t>
+      </w:r>
+      <w:proofErr w:type="spellEnd"/>
+    </w:p>
+    <w:p>
+      <w:r>
+        <w:rPr>
+          <w:rFonts w:ascii="Arial" w:hAnsi="Arial"/>
+          <w:sz w:val="20"/>
+        </w:rPr>
+        <w:t>9</w:t>
+      </w:r>
+    </w:p>
+    <w:p>
+      <w:pPr>
+        <w:pStyle w:val="Heading2"/>
+      </w:pPr>
+      <w:r>
+        <w:rPr>
+          <w:rFonts w:ascii="Arial" w:hAnsi="Arial"/>
+          <w:sz w:val="20"/>
+        </w:rPr>
+        <w:t>Trigger Rule</w:t>
+      </w:r>
+    </w:p>
+    <w:p>
+      <w:r>
+        <w:rPr>
+          <w:rFonts w:ascii="Arial" w:hAnsi="Arial"/>
+          <w:sz w:val="20"/>
+        </w:rPr>
+        <w:t>Trigger this requirement only when both conditions are met:</w:t>
+      </w:r>
+    </w:p>
+    <w:p>
+      <w:pPr>
+        <w:pStyle w:val="ListNumber"/>
+        <w:numPr>
+          <w:ilvl w:val="0"/>
+          <w:numId w:val="12"/>
+        </w:numPr>
+      </w:pPr>
+      <w:r>
+        <w:rPr>
+          <w:rFonts w:ascii="Arial" w:hAnsi="Arial"/>
+          <w:sz w:val="20"/>
+        </w:rPr>
+        <w:t>The Selling Country is Italy, either from metadata or explicit document evidence</w:t>
+      </w:r>
+      <w:r>
+        <w:rPr>
+          <w:rFonts w:ascii="Arial" w:hAnsi="Arial"/>
+          <w:sz w:val="20"/>
+        </w:rPr>
+        <w:t>.</w:t>
+      </w:r>
+    </w:p>
+    <w:p>
+      <w:pPr>
+        <w:pStyle w:val="ListNumber"/>
+        <w:numPr>
+          <w:ilvl w:val="0"/>
+          <w:numId w:val="12"/>
+        </w:numPr>
+      </w:pPr>
+      <w:r>
+        <w:rPr>
+          <w:rFonts w:ascii="Arial" w:hAnsi="Arial"/>
+          <w:sz w:val="20"/>
+        </w:rPr>
+        <w:t>The NDA contains insider trading, securities law, market abuse, or inside information obligations.</w:t>
+      </w:r>
+    </w:p>
+    <w:p>
+      <w:pPr>
+        <w:pStyle w:val="ListNumber"/>
+        <w:numPr>
+          <w:ilvl w:val="0"/>
+          <w:numId w:val="0"/>
+        </w:numPr>
+        <w:ind w:left="720"/>
+      </w:pPr>
+    </w:p>
+    <w:p>
+      <w:pPr>
+        <w:pStyle w:val="ListNumber"/>
+        <w:numPr>
+          <w:ilvl w:val="0"/>
+          <w:numId w:val="0"/>
+        </w:numPr>
+        <w:ind w:left="360"/>
+        <w:rPr>
+          <w:rFonts w:ascii="Arial" w:hAnsi="Arial" w:cs="Arial"/>
+          <w:sz w:val="20"/>
+          <w:szCs w:val="20"/>
+        </w:rPr>
+      </w:pPr>
+      <w:r>
+        <w:rPr>
+          <w:rFonts w:ascii="Arial" w:hAnsi="Arial" w:cs="Arial"/>
+          <w:sz w:val="20"/>
+          <w:szCs w:val="20"/>
+        </w:rPr>
+        <w:t>If Selling Country metadata is provided and the value is not Italy, this requirement MUST NOT trigger regardless of the NDA content.</w:t>
+      </w:r>
+    </w:p>
+    <w:p>
+      <w:pPr>
+        <w:pStyle w:val="ListNumber"/>
+        <w:numPr>
+          <w:ilvl w:val="0"/>
+          <w:numId w:val="0"/>
+        </w:numPr>
+        <w:ind w:left="360"/>
+        <w:rPr>
+          <w:rFonts w:ascii="Arial" w:hAnsi="Arial" w:cs="Arial"/>
+          <w:sz w:val="20"/>
+          <w:szCs w:val="20"/>
+        </w:rPr>
+      </w:pPr>
+    </w:p>
+    <w:p>
+      <w:pPr>
+        <w:pStyle w:val="ListNumber"/>
+        <w:numPr>
+          <w:ilvl w:val="0"/>
+          <w:numId w:val="0"/>
+        </w:numPr>
+        <w:ind w:left="360"/>
+        <w:rPr>
+          <w:rFonts w:ascii="Arial" w:hAnsi="Arial" w:cs="Arial"/>
+          <w:sz w:val="20"/>
+          <w:szCs w:val="20"/>
+        </w:rPr>
+      </w:pPr>
+      <w:r>
+        <w:rPr>
+          <w:rFonts w:ascii="Arial" w:hAnsi="Arial" w:cs="Arial"/>
+          <w:sz w:val="20"/>
+          <w:szCs w:val="20"/>
+        </w:rPr>
+        <w:t>If Selling Country metadata is provided, Selling Country metadata takes precedence over inferred country information from the NDA text.</w:t>
+      </w:r>
+    </w:p>
+    <w:p>
+      <w:pPr>
+        <w:pStyle w:val="Heading2"/>
+      </w:pPr>
+      <w:r>
+        <w:rPr>
+          <w:rFonts w:ascii="Arial" w:hAnsi="Arial"/>
+          <w:sz w:val="20"/>
+        </w:rPr>
+        <w:t>Trigger Indicators</w:t>
+      </w:r>
+    </w:p>
+    <w:p>
+      <w:pPr>
+        <w:pStyle w:val="ListBullet"/>
+      </w:pPr>
+      <w:r>
+        <w:rPr>
+          <w:rFonts w:ascii="Arial" w:hAnsi="Arial"/>
+          <w:sz w:val="20"/>
+        </w:rPr>
+        <w:t>insider trading</w:t>
+      </w:r>
+    </w:p>
+    <w:p>
+      <w:pPr>
+        <w:pStyle w:val="ListBullet"/>
+      </w:pPr>
+      <w:r>
+        <w:rPr>
+          <w:rFonts w:ascii="Arial" w:hAnsi="Arial"/>
+          <w:sz w:val="20"/>
+        </w:rPr>
+        <w:t>inside information</w:t>
+      </w:r>
+    </w:p>
+    <w:p>
+      <w:pPr>
+        <w:pStyle w:val="ListBullet"/>
+      </w:pPr>
+      <w:r>
+        <w:rPr>
+          <w:rFonts w:ascii="Arial" w:hAnsi="Arial"/>
+          <w:sz w:val="20"/>
+        </w:rPr>
+        <w:t>market abuse</w:t>
+      </w:r>
+    </w:p>
+    <w:p>
+      <w:pPr>
+        <w:pStyle w:val="ListBullet"/>
+      </w:pPr>
+      <w:r>
+        <w:rPr>
+          <w:rFonts w:ascii="Arial" w:hAnsi="Arial"/>
+          <w:sz w:val="20"/>
+        </w:rPr>
         <w:lastRenderedPageBreak/>
-        <w:t>deed of confidentiality</w:t>
+        <w:t>securities laws</w:t>
       </w:r>
     </w:p>
     <w:p>
@@ -1398,7 +1862,7 @@
           <w:rFonts w:ascii="Arial" w:hAnsi="Arial"/>
           <w:sz w:val="20"/>
         </w:rPr>
-        <w:t>mutual confidentiality deed</w:t>
+        <w:t>Italian securities laws</w:t>
       </w:r>
     </w:p>
     <w:p>
@@ -1410,7 +1874,7 @@
           <w:rFonts w:ascii="Arial" w:hAnsi="Arial"/>
           <w:sz w:val="20"/>
         </w:rPr>
-        <w:t>signed, sealed and delivered</w:t>
+        <w:t>trading restrictions</w:t>
       </w:r>
     </w:p>
     <w:p>
@@ -1422,7 +1886,7 @@
           <w:rFonts w:ascii="Arial" w:hAnsi="Arial"/>
           <w:sz w:val="20"/>
         </w:rPr>
-        <w:t>witness requirements tied to deed execution</w:t>
+        <w:t>market abuse regulation</w:t>
       </w:r>
     </w:p>
     <w:p>
@@ -1455,7 +1919,7 @@
           <w:rFonts w:ascii="Arial" w:hAnsi="Arial"/>
           <w:sz w:val="20"/>
         </w:rPr>
-        <w:t>Only generic signature language exists.</w:t>
+        <w:t>Only generic confidentiality language exists.</w:t>
       </w:r>
     </w:p>
     <w:p>
@@ -1467,7 +1931,7 @@
           <w:rFonts w:ascii="Arial" w:hAnsi="Arial"/>
           <w:sz w:val="20"/>
         </w:rPr>
-        <w:t>Only counterpart or electronic signature language exists.</w:t>
+        <w:t>Only generic compliance with laws exists.</w:t>
       </w:r>
     </w:p>
     <w:p>
@@ -1479,7 +1943,7 @@
           <w:rFonts w:ascii="Arial" w:hAnsi="Arial"/>
           <w:sz w:val="20"/>
         </w:rPr>
-        <w:t>The applicable country is not Australia or New Zealand.</w:t>
+        <w:t>Only governing law references exist.</w:t>
       </w:r>
     </w:p>
     <w:p>
@@ -1491,7 +1955,25 @@
           <w:rFonts w:ascii="Arial" w:hAnsi="Arial"/>
           <w:sz w:val="20"/>
         </w:rPr>
-        <w:t>Country evidence is missing or conflicting.</w:t>
+        <w:t>Italy is mentioned without insider trading or securities obligations.</w:t>
+      </w:r>
+    </w:p>
+    <w:p>
+      <w:pPr>
+        <w:pStyle w:val="ListBullet"/>
+        <w:rPr>
+          <w:rFonts w:ascii="Arial" w:hAnsi="Arial" w:cs="Arial"/>
+          <w:sz w:val="20"/>
+          <w:szCs w:val="20"/>
+        </w:rPr>
+      </w:pPr>
+      <w:r>
+        <w:rPr>
+          <w:rFonts w:ascii="Arial" w:hAnsi="Arial" w:cs="Arial"/>
+          <w:sz w:val="20"/>
+          <w:szCs w:val="20"/>
+        </w:rPr>
+        <w:t>Selling Country metadata is provided and is not Italy.</w:t>
       </w:r>
     </w:p>
     <w:p>
@@ -1512,23 +1994,7 @@
           <w:rFonts w:ascii="Arial" w:hAnsi="Arial"/>
           <w:sz w:val="20"/>
         </w:rPr>
-        <w:t xml:space="preserve">This NDA requires </w:t>
-      </w:r>
-      <w:proofErr w:type="gramStart"/>
-      <w:r>
-        <w:rPr>
-          <w:rFonts w:ascii="Arial" w:hAnsi="Arial"/>
-          <w:sz w:val="20"/>
-        </w:rPr>
-        <w:t>signature</w:t>
-      </w:r>
-      <w:proofErr w:type="gramEnd"/>
-      <w:r>
-        <w:rPr>
-          <w:rFonts w:ascii="Arial" w:hAnsi="Arial"/>
-          <w:sz w:val="20"/>
-        </w:rPr>
-        <w:t xml:space="preserve"> by deed and requires legal support for processing.</w:t>
+        <w:t>This NDA includes an insider trading clause and requires legal support for processing.</w:t>
       </w:r>
     </w:p>
     <w:p>
@@ -1540,273 +2006,6 @@
           <w:rFonts w:ascii="Arial" w:hAnsi="Arial"/>
           <w:sz w:val="20"/>
         </w:rPr>
-        <w:t>6. Requirement 4: Insider Trading (For Contracting in Italy)</w:t>
-      </w:r>
-    </w:p>
-    <w:p>
-      <w:pPr>
-        <w:pStyle w:val="Heading2"/>
-      </w:pPr>
-      <w:proofErr w:type="spellStart"/>
-      <w:r>
-        <w:rPr>
-          <w:rFonts w:ascii="Arial" w:hAnsi="Arial"/>
-          <w:sz w:val="20"/>
-        </w:rPr>
-        <w:t>RiskID</w:t>
-      </w:r>
-      <w:proofErr w:type="spellEnd"/>
-    </w:p>
-    <w:p>
-      <w:r>
-        <w:rPr>
-          <w:rFonts w:ascii="Arial" w:hAnsi="Arial"/>
-          <w:sz w:val="20"/>
-        </w:rPr>
-        <w:t>9</w:t>
-      </w:r>
-    </w:p>
-    <w:p>
-      <w:pPr>
-        <w:pStyle w:val="Heading2"/>
-      </w:pPr>
-      <w:r>
-        <w:rPr>
-          <w:rFonts w:ascii="Arial" w:hAnsi="Arial"/>
-          <w:sz w:val="20"/>
-        </w:rPr>
-        <w:t>Trigger Rule</w:t>
-      </w:r>
-    </w:p>
-    <w:p>
-      <w:r>
-        <w:rPr>
-          <w:rFonts w:ascii="Arial" w:hAnsi="Arial"/>
-          <w:sz w:val="20"/>
-        </w:rPr>
-        <w:t>Trigger this requirement only when both conditions are met:</w:t>
-      </w:r>
-    </w:p>
-    <w:p>
-      <w:pPr>
-        <w:pStyle w:val="ListNumber"/>
-      </w:pPr>
-      <w:r>
-        <w:rPr>
-          <w:rFonts w:ascii="Arial" w:hAnsi="Arial"/>
-          <w:sz w:val="20"/>
-        </w:rPr>
-        <w:t>The applicable country is Italy, either from metadata or explicit document evidence.</w:t>
-      </w:r>
-    </w:p>
-    <w:p>
-      <w:pPr>
-        <w:pStyle w:val="ListNumber"/>
-      </w:pPr>
-      <w:r>
-        <w:rPr>
-          <w:rFonts w:ascii="Arial" w:hAnsi="Arial"/>
-          <w:sz w:val="20"/>
-        </w:rPr>
-        <w:t>The NDA contains insider trading, securities law, market abuse, or inside information obligations.</w:t>
-      </w:r>
-    </w:p>
-    <w:p>
-      <w:pPr>
-        <w:pStyle w:val="Heading2"/>
-      </w:pPr>
-      <w:r>
-        <w:rPr>
-          <w:rFonts w:ascii="Arial" w:hAnsi="Arial"/>
-          <w:sz w:val="20"/>
-        </w:rPr>
-        <w:t>Trigger Indicators</w:t>
-      </w:r>
-    </w:p>
-    <w:p>
-      <w:pPr>
-        <w:pStyle w:val="ListBullet"/>
-      </w:pPr>
-      <w:r>
-        <w:rPr>
-          <w:rFonts w:ascii="Arial" w:hAnsi="Arial"/>
-          <w:sz w:val="20"/>
-        </w:rPr>
-        <w:t>insider trading</w:t>
-      </w:r>
-    </w:p>
-    <w:p>
-      <w:pPr>
-        <w:pStyle w:val="ListBullet"/>
-      </w:pPr>
-      <w:r>
-        <w:rPr>
-          <w:rFonts w:ascii="Arial" w:hAnsi="Arial"/>
-          <w:sz w:val="20"/>
-        </w:rPr>
-        <w:t>inside information</w:t>
-      </w:r>
-    </w:p>
-    <w:p>
-      <w:pPr>
-        <w:pStyle w:val="ListBullet"/>
-      </w:pPr>
-      <w:r>
-        <w:rPr>
-          <w:rFonts w:ascii="Arial" w:hAnsi="Arial"/>
-          <w:sz w:val="20"/>
-        </w:rPr>
-        <w:t>market abuse</w:t>
-      </w:r>
-    </w:p>
-    <w:p>
-      <w:pPr>
-        <w:pStyle w:val="ListBullet"/>
-      </w:pPr>
-      <w:r>
-        <w:rPr>
-          <w:rFonts w:ascii="Arial" w:hAnsi="Arial"/>
-          <w:sz w:val="20"/>
-        </w:rPr>
-        <w:t>securities laws</w:t>
-      </w:r>
-    </w:p>
-    <w:p>
-      <w:pPr>
-        <w:pStyle w:val="ListBullet"/>
-      </w:pPr>
-      <w:r>
-        <w:rPr>
-          <w:rFonts w:ascii="Arial" w:hAnsi="Arial"/>
-          <w:sz w:val="20"/>
-        </w:rPr>
-        <w:t>Italian securities laws</w:t>
-      </w:r>
-    </w:p>
-    <w:p>
-      <w:pPr>
-        <w:pStyle w:val="ListBullet"/>
-      </w:pPr>
-      <w:r>
-        <w:rPr>
-          <w:rFonts w:ascii="Arial" w:hAnsi="Arial"/>
-          <w:sz w:val="20"/>
-        </w:rPr>
-        <w:t>trading restrictions</w:t>
-      </w:r>
-    </w:p>
-    <w:p>
-      <w:pPr>
-        <w:pStyle w:val="ListBullet"/>
-      </w:pPr>
-      <w:r>
-        <w:rPr>
-          <w:rFonts w:ascii="Arial" w:hAnsi="Arial"/>
-          <w:sz w:val="20"/>
-        </w:rPr>
-        <w:t>market abuse regulation</w:t>
-      </w:r>
-    </w:p>
-    <w:p>
-      <w:pPr>
-        <w:pStyle w:val="Heading2"/>
-      </w:pPr>
-      <w:r>
-        <w:rPr>
-          <w:rFonts w:ascii="Arial" w:hAnsi="Arial"/>
-          <w:sz w:val="20"/>
-        </w:rPr>
-        <w:t>Do Not Trigger</w:t>
-      </w:r>
-    </w:p>
-    <w:p>
-      <w:r>
-        <w:rPr>
-          <w:rFonts w:ascii="Arial" w:hAnsi="Arial"/>
-          <w:sz w:val="20"/>
-        </w:rPr>
-        <w:t>Do not trigger this requirement when:</w:t>
-      </w:r>
-    </w:p>
-    <w:p>
-      <w:pPr>
-        <w:pStyle w:val="ListBullet"/>
-      </w:pPr>
-      <w:r>
-        <w:rPr>
-          <w:rFonts w:ascii="Arial" w:hAnsi="Arial"/>
-          <w:sz w:val="20"/>
-        </w:rPr>
-        <w:t>Only generic confidentiality language exists.</w:t>
-      </w:r>
-    </w:p>
-    <w:p>
-      <w:pPr>
-        <w:pStyle w:val="ListBullet"/>
-      </w:pPr>
-      <w:r>
-        <w:rPr>
-          <w:rFonts w:ascii="Arial" w:hAnsi="Arial"/>
-          <w:sz w:val="20"/>
-        </w:rPr>
-        <w:t>Only generic compliance with laws exists.</w:t>
-      </w:r>
-    </w:p>
-    <w:p>
-      <w:pPr>
-        <w:pStyle w:val="ListBullet"/>
-      </w:pPr>
-      <w:r>
-        <w:rPr>
-          <w:rFonts w:ascii="Arial" w:hAnsi="Arial"/>
-          <w:sz w:val="20"/>
-        </w:rPr>
-        <w:t>Only governing law references exist.</w:t>
-      </w:r>
-    </w:p>
-    <w:p>
-      <w:pPr>
-        <w:pStyle w:val="ListBullet"/>
-      </w:pPr>
-      <w:r>
-        <w:rPr>
-          <w:rFonts w:ascii="Arial" w:hAnsi="Arial"/>
-          <w:sz w:val="20"/>
-        </w:rPr>
-        <w:t>Italy is mentioned without insider trading or securities obligations.</w:t>
-      </w:r>
-    </w:p>
-    <w:p>
-      <w:pPr>
-        <w:pStyle w:val="Heading2"/>
-      </w:pPr>
-      <w:r>
-        <w:rPr>
-          <w:rFonts w:ascii="Arial" w:hAnsi="Arial"/>
-          <w:sz w:val="20"/>
-        </w:rPr>
-        <w:t>Static Display Text</w:t>
-      </w:r>
-    </w:p>
-    <w:p>
-      <w:r>
-        <w:rPr>
-          <w:rFonts w:ascii="Arial" w:hAnsi="Arial"/>
-          <w:sz w:val="20"/>
-        </w:rPr>
-        <w:t>This NDA includes an insider trading clause and requires legal support for processing.</w:t>
-      </w:r>
-    </w:p>
-    <w:p>
-      <w:pPr>
-        <w:pStyle w:val="Heading1"/>
-      </w:pPr>
-      <w:r>
-        <w:rPr>
-          <w:rFonts w:ascii="Arial" w:hAnsi="Arial"/>
-          <w:sz w:val="20"/>
-        </w:rPr>
-        <w:lastRenderedPageBreak/>
         <w:t>7. Output and Routing Guidance</w:t>
       </w:r>
     </w:p>
@@ -2184,6 +2383,92 @@
       <w:rPr>
         <w:rFonts w:ascii="Symbol" w:hAnsi="Symbol" w:hint="default"/>
       </w:rPr>
+    </w:lvl>
+  </w:abstractNum>
+  <w:abstractNum w:abstractNumId="9" w15:restartNumberingAfterBreak="0">
+    <w:nsid w:val="101E6F58"/>
+    <w:multiLevelType w:val="hybridMultilevel"/>
+    <w:tmpl w:val="8918E2D2"/>
+    <w:lvl w:ilvl="0" w:tplc="0409000F">
+      <w:start w:val="1"/>
+      <w:numFmt w:val="decimal"/>
+      <w:lvlText w:val="%1."/>
+      <w:lvlJc w:val="left"/>
+      <w:pPr>
+        <w:ind w:left="720" w:hanging="360"/>
+      </w:pPr>
+    </w:lvl>
+    <w:lvl w:ilvl="1" w:tplc="04090019" w:tentative="1">
+      <w:start w:val="1"/>
+      <w:numFmt w:val="lowerLetter"/>
+      <w:lvlText w:val="%2."/>
+      <w:lvlJc w:val="left"/>
+      <w:pPr>
+        <w:ind w:left="1440" w:hanging="360"/>
+      </w:pPr>
+    </w:lvl>
+    <w:lvl w:ilvl="2" w:tplc="0409001B" w:tentative="1">
+      <w:start w:val="1"/>
+      <w:numFmt w:val="lowerRoman"/>
+      <w:lvlText w:val="%3."/>
+      <w:lvlJc w:val="right"/>
+      <w:pPr>
+        <w:ind w:left="2160" w:hanging="180"/>
+      </w:pPr>
+    </w:lvl>
+    <w:lvl w:ilvl="3" w:tplc="0409000F" w:tentative="1">
+      <w:start w:val="1"/>
+      <w:numFmt w:val="decimal"/>
+      <w:lvlText w:val="%4."/>
+      <w:lvlJc w:val="left"/>
+      <w:pPr>
+        <w:ind w:left="2880" w:hanging="360"/>
+      </w:pPr>
+    </w:lvl>
+    <w:lvl w:ilvl="4" w:tplc="04090019" w:tentative="1">
+      <w:start w:val="1"/>
+      <w:numFmt w:val="lowerLetter"/>
+      <w:lvlText w:val="%5."/>
+      <w:lvlJc w:val="left"/>
+      <w:pPr>
+        <w:ind w:left="3600" w:hanging="360"/>
+      </w:pPr>
+    </w:lvl>
+    <w:lvl w:ilvl="5" w:tplc="0409001B" w:tentative="1">
+      <w:start w:val="1"/>
+      <w:numFmt w:val="lowerRoman"/>
+      <w:lvlText w:val="%6."/>
+      <w:lvlJc w:val="right"/>
+      <w:pPr>
+        <w:ind w:left="4320" w:hanging="180"/>
+      </w:pPr>
+    </w:lvl>
+    <w:lvl w:ilvl="6" w:tplc="0409000F" w:tentative="1">
+      <w:start w:val="1"/>
+      <w:numFmt w:val="decimal"/>
+      <w:lvlText w:val="%7."/>
+      <w:lvlJc w:val="left"/>
+      <w:pPr>
+        <w:ind w:left="5040" w:hanging="360"/>
+      </w:pPr>
+    </w:lvl>
+    <w:lvl w:ilvl="7" w:tplc="04090019" w:tentative="1">
+      <w:start w:val="1"/>
+      <w:numFmt w:val="lowerLetter"/>
+      <w:lvlText w:val="%8."/>
+      <w:lvlJc w:val="left"/>
+      <w:pPr>
+        <w:ind w:left="5760" w:hanging="360"/>
+      </w:pPr>
+    </w:lvl>
+    <w:lvl w:ilvl="8" w:tplc="0409001B" w:tentative="1">
+      <w:start w:val="1"/>
+      <w:numFmt w:val="lowerRoman"/>
+      <w:lvlText w:val="%9."/>
+      <w:lvlJc w:val="right"/>
+      <w:pPr>
+        <w:ind w:left="6480" w:hanging="180"/>
+      </w:pPr>
     </w:lvl>
   </w:abstractNum>
   <w:num w:numId="1" w16cid:durableId="962006736">
@@ -2218,6 +2503,9 @@
   </w:num>
   <w:num w:numId="11" w16cid:durableId="1003318553">
     <w:abstractNumId w:val="7"/>
+  </w:num>
+  <w:num w:numId="12" w16cid:durableId="1717244001">
+    <w:abstractNumId w:val="9"/>
   </w:num>
 </w:numbering>
 </file>
@@ -2825,7 +3113,6 @@
   <w:style w:type="character" w:default="1" w:styleId="DefaultParagraphFont">
     <w:name w:val="Default Paragraph Font"/>
     <w:uiPriority w:val="1"/>
-    <w:semiHidden/>
     <w:unhideWhenUsed/>
   </w:style>
   <w:style w:type="table" w:default="1" w:styleId="TableNormal">

</xml_diff>

<commit_message>
Adjust AR KB to address selling country blank field
</commit_message>
<xml_diff>
--- a/docs/additional_requirements_nda_kb.docx
+++ b/docs/additional_requirements_nda_kb.docx
@@ -1382,6 +1382,59 @@
         </w:rPr>
         <w:lastRenderedPageBreak/>
         <w:t>If Selling Country metadata is provided and the value is not Australia or New Zealand, this requirement MUST NOT trigger regardless of deed-related language.</w:t>
+      </w:r>
+    </w:p>
+    <w:p>
+      <w:pPr>
+        <w:pStyle w:val="ListNumber"/>
+        <w:numPr>
+          <w:ilvl w:val="0"/>
+          <w:numId w:val="0"/>
+        </w:numPr>
+        <w:rPr>
+          <w:rFonts w:ascii="Arial" w:hAnsi="Arial" w:cs="Arial"/>
+          <w:sz w:val="20"/>
+          <w:szCs w:val="20"/>
+        </w:rPr>
+      </w:pPr>
+    </w:p>
+    <w:p>
+      <w:pPr>
+        <w:pStyle w:val="ListNumber"/>
+        <w:numPr>
+          <w:ilvl w:val="0"/>
+          <w:numId w:val="0"/>
+        </w:numPr>
+        <w:ind w:left="360" w:hanging="360"/>
+        <w:rPr>
+          <w:rFonts w:ascii="Arial" w:hAnsi="Arial" w:cs="Arial"/>
+          <w:sz w:val="20"/>
+          <w:szCs w:val="20"/>
+        </w:rPr>
+      </w:pPr>
+      <w:r>
+        <w:rPr>
+          <w:rFonts w:ascii="Arial" w:hAnsi="Arial" w:cs="Arial"/>
+          <w:sz w:val="20"/>
+          <w:szCs w:val="20"/>
+        </w:rPr>
+        <w:t>If Selling Country metadata is missing, blank, or unavailable,</w:t>
+      </w:r>
+      <w:r>
+        <w:rPr>
+          <w:rFonts w:ascii="Arial" w:hAnsi="Arial" w:cs="Arial"/>
+          <w:sz w:val="20"/>
+          <w:szCs w:val="20"/>
+        </w:rPr>
+        <w:t xml:space="preserve"> </w:t>
+      </w:r>
+      <w:r>
+        <w:rPr>
+          <w:rFonts w:ascii="Arial" w:hAnsi="Arial" w:cs="Arial"/>
+          <w:sz w:val="20"/>
+          <w:szCs w:val="20"/>
+        </w:rPr>
+        <w:t>this requirement MUST NOT trigger.</w:t>
       </w:r>
     </w:p>
     <w:p>
@@ -1789,6 +1842,44 @@
           <w:sz w:val="20"/>
           <w:szCs w:val="20"/>
         </w:rPr>
+        <w:t>If Selling Country metadata is missing, blank, or unavailable, this requirement MUST NOT trigger.</w:t>
+      </w:r>
+    </w:p>
+    <w:p>
+      <w:pPr>
+        <w:pStyle w:val="ListNumber"/>
+        <w:numPr>
+          <w:ilvl w:val="0"/>
+          <w:numId w:val="0"/>
+        </w:numPr>
+        <w:ind w:left="360"/>
+        <w:rPr>
+          <w:rFonts w:ascii="Arial" w:hAnsi="Arial" w:cs="Arial"/>
+          <w:sz w:val="20"/>
+          <w:szCs w:val="20"/>
+        </w:rPr>
+      </w:pPr>
+    </w:p>
+    <w:p>
+      <w:pPr>
+        <w:pStyle w:val="ListNumber"/>
+        <w:numPr>
+          <w:ilvl w:val="0"/>
+          <w:numId w:val="0"/>
+        </w:numPr>
+        <w:ind w:left="360"/>
+        <w:rPr>
+          <w:rFonts w:ascii="Arial" w:hAnsi="Arial" w:cs="Arial"/>
+          <w:sz w:val="20"/>
+          <w:szCs w:val="20"/>
+        </w:rPr>
+      </w:pPr>
+      <w:r>
+        <w:rPr>
+          <w:rFonts w:ascii="Arial" w:hAnsi="Arial" w:cs="Arial"/>
+          <w:sz w:val="20"/>
+          <w:szCs w:val="20"/>
+        </w:rPr>
         <w:t>If Selling Country metadata is provided, Selling Country metadata takes precedence over inferred country information from the NDA text.</w:t>
       </w:r>
     </w:p>
@@ -1801,6 +1892,7 @@
           <w:rFonts w:ascii="Arial" w:hAnsi="Arial"/>
           <w:sz w:val="20"/>
         </w:rPr>
+        <w:lastRenderedPageBreak/>
         <w:t>Trigger Indicators</w:t>
       </w:r>
     </w:p>
@@ -1849,7 +1941,6 @@
           <w:rFonts w:ascii="Arial" w:hAnsi="Arial"/>
           <w:sz w:val="20"/>
         </w:rPr>
-        <w:lastRenderedPageBreak/>
         <w:t>securities laws</w:t>
       </w:r>
     </w:p>
@@ -2349,7 +2440,7 @@
   <w:abstractNum w:abstractNumId="7" w15:restartNumberingAfterBreak="0">
     <w:nsid w:val="FFFFFF88"/>
     <w:multiLevelType w:val="singleLevel"/>
-    <w:tmpl w:val="30105528"/>
+    <w:tmpl w:val="7818B356"/>
     <w:lvl w:ilvl="0">
       <w:start w:val="1"/>
       <w:numFmt w:val="decimal"/>
@@ -2506,6 +2597,15 @@
   </w:num>
   <w:num w:numId="12" w16cid:durableId="1717244001">
     <w:abstractNumId w:val="9"/>
+  </w:num>
+  <w:num w:numId="13" w16cid:durableId="1242133039">
+    <w:abstractNumId w:val="7"/>
+  </w:num>
+  <w:num w:numId="14" w16cid:durableId="942227166">
+    <w:abstractNumId w:val="7"/>
+  </w:num>
+  <w:num w:numId="15" w16cid:durableId="1017196611">
+    <w:abstractNumId w:val="7"/>
   </w:num>
 </w:numbering>
 </file>

</xml_diff>

<commit_message>
Update additional requirements kb
</commit_message>
<xml_diff>
--- a/docs/additional_requirements_nda_kb.docx
+++ b/docs/additional_requirements_nda_kb.docx
@@ -1321,7 +1321,7 @@
           <w:rFonts w:ascii="Arial" w:hAnsi="Arial"/>
           <w:sz w:val="20"/>
         </w:rPr>
-        <w:t>The Selling Country is Australia or New Zealand, either from metadata or explicit document evidence.</w:t>
+        <w:t>Selling Country metadata is Australia or New Zealand; AND</w:t>
       </w:r>
     </w:p>
     <w:p>
@@ -1333,23 +1333,7 @@
           <w:rFonts w:ascii="Arial" w:hAnsi="Arial"/>
           <w:sz w:val="20"/>
         </w:rPr>
-        <w:t xml:space="preserve">The NDA requires execution as a deed or deed-like </w:t>
-      </w:r>
-      <w:proofErr w:type="gramStart"/>
-      <w:r>
-        <w:rPr>
-          <w:rFonts w:ascii="Arial" w:hAnsi="Arial"/>
-          <w:sz w:val="20"/>
-        </w:rPr>
-        <w:t>formalities</w:t>
-      </w:r>
-      <w:proofErr w:type="gramEnd"/>
-      <w:r>
-        <w:rPr>
-          <w:rFonts w:ascii="Arial" w:hAnsi="Arial"/>
-          <w:sz w:val="20"/>
-        </w:rPr>
-        <w:t>.</w:t>
+        <w:t>The NDA expressly requires execution as a deed or otherwise clearly identifies the document as a deed.</w:t>
       </w:r>
     </w:p>
     <w:p>
@@ -1359,6 +1343,7 @@
           <w:ilvl w:val="0"/>
           <w:numId w:val="0"/>
         </w:numPr>
+        <w:ind w:left="360"/>
       </w:pPr>
     </w:p>
     <w:p>
@@ -1530,7 +1515,23 @@
           <w:rFonts w:ascii="Arial" w:hAnsi="Arial"/>
           <w:sz w:val="20"/>
         </w:rPr>
-        <w:t>signed, sealed and delivered</w:t>
+        <w:t>“</w:t>
+      </w:r>
+      <w:proofErr w:type="gramStart"/>
+      <w:r>
+        <w:rPr>
+          <w:rFonts w:ascii="Arial" w:hAnsi="Arial"/>
+          <w:sz w:val="20"/>
+        </w:rPr>
+        <w:t>signed</w:t>
+      </w:r>
+      <w:proofErr w:type="gramEnd"/>
+      <w:r>
+        <w:rPr>
+          <w:rFonts w:ascii="Arial" w:hAnsi="Arial"/>
+          <w:sz w:val="20"/>
+        </w:rPr>
+        <w:t>, sealed and delivered” when accompanied by express deed-execution language or when the document otherwise clearly identifies itself as a deed</w:t>
       </w:r>
     </w:p>
     <w:p>
@@ -1605,13 +1606,19 @@
     <w:p>
       <w:pPr>
         <w:pStyle w:val="ListBullet"/>
-      </w:pPr>
-      <w:r>
-        <w:rPr>
-          <w:rFonts w:ascii="Arial" w:hAnsi="Arial"/>
-          <w:sz w:val="20"/>
-        </w:rPr>
-        <w:t>Country evidence is missing or conflicting.</w:t>
+        <w:rPr>
+          <w:rFonts w:ascii="Arial" w:hAnsi="Arial" w:cs="Arial"/>
+          <w:sz w:val="20"/>
+          <w:szCs w:val="20"/>
+        </w:rPr>
+      </w:pPr>
+      <w:r>
+        <w:rPr>
+          <w:rFonts w:ascii="Arial" w:hAnsi="Arial" w:cs="Arial"/>
+          <w:sz w:val="20"/>
+          <w:szCs w:val="20"/>
+        </w:rPr>
+        <w:t>Selling Country metadata is provided and is not Australia or New Zealand.</w:t>
       </w:r>
     </w:p>
     <w:p>
@@ -1629,7 +1636,43 @@
           <w:sz w:val="20"/>
           <w:szCs w:val="20"/>
         </w:rPr>
-        <w:t>Selling Country metadata is provided and is not Australia or New Zealand.</w:t>
+        <w:t xml:space="preserve">Do NOT trigger where the execution block </w:t>
+      </w:r>
+      <w:proofErr w:type="gramStart"/>
+      <w:r>
+        <w:rPr>
+          <w:rFonts w:ascii="Arial" w:hAnsi="Arial" w:cs="Arial"/>
+          <w:sz w:val="20"/>
+          <w:szCs w:val="20"/>
+        </w:rPr>
+        <w:t>states</w:t>
+      </w:r>
+      <w:proofErr w:type="gramEnd"/>
+      <w:r>
+        <w:rPr>
+          <w:rFonts w:ascii="Arial" w:hAnsi="Arial" w:cs="Arial"/>
+          <w:sz w:val="20"/>
+          <w:szCs w:val="20"/>
+        </w:rPr>
+        <w:t xml:space="preserve"> “Executed as an Agreement” and the document does not expressly require execution as a deed.</w:t>
+      </w:r>
+    </w:p>
+    <w:p>
+      <w:pPr>
+        <w:pStyle w:val="ListBullet"/>
+        <w:rPr>
+          <w:rFonts w:ascii="Arial" w:hAnsi="Arial" w:cs="Arial"/>
+          <w:sz w:val="20"/>
+          <w:szCs w:val="20"/>
+        </w:rPr>
+      </w:pPr>
+      <w:r>
+        <w:rPr>
+          <w:rFonts w:ascii="Arial" w:hAnsi="Arial" w:cs="Arial"/>
+          <w:sz w:val="20"/>
+          <w:szCs w:val="20"/>
+        </w:rPr>
+        <w:t>“Signed, sealed and delivered” alone is insufficient to establish deed execution when the document otherwise identifies itself as an agreement rather than a deed.</w:t>
       </w:r>
     </w:p>
     <w:p>
@@ -1748,14 +1791,7 @@
           <w:rFonts w:ascii="Arial" w:hAnsi="Arial"/>
           <w:sz w:val="20"/>
         </w:rPr>
-        <w:t>The Selling Country is Italy, either from metadata or explicit document evidence</w:t>
-      </w:r>
-      <w:r>
-        <w:rPr>
-          <w:rFonts w:ascii="Arial" w:hAnsi="Arial"/>
-          <w:sz w:val="20"/>
-        </w:rPr>
-        <w:t>.</w:t>
+        <w:t>Selling Country metadata is explicitly provided as Italy; AND</w:t>
       </w:r>
     </w:p>
     <w:p>
@@ -1771,8 +1807,24 @@
           <w:rFonts w:ascii="Arial" w:hAnsi="Arial"/>
           <w:sz w:val="20"/>
         </w:rPr>
-        <w:t>The NDA contains insider trading, securities law, market abuse, or inside information obligations.</w:t>
-      </w:r>
+        <w:t xml:space="preserve">The NDA contains at least one clear insider trading, market abuse, inside information, or securities-law </w:t>
+      </w:r>
+      <w:proofErr w:type="gramStart"/>
+      <w:r>
+        <w:rPr>
+          <w:rFonts w:ascii="Arial" w:hAnsi="Arial"/>
+          <w:sz w:val="20"/>
+        </w:rPr>
+        <w:t>obligation.</w:t>
+      </w:r>
+      <w:r>
+        <w:rPr>
+          <w:rFonts w:ascii="Arial" w:hAnsi="Arial"/>
+          <w:sz w:val="20"/>
+        </w:rPr>
+        <w:t>.</w:t>
+      </w:r>
+      <w:proofErr w:type="gramEnd"/>
     </w:p>
     <w:p>
       <w:pPr>
@@ -1842,6 +1894,7 @@
           <w:sz w:val="20"/>
           <w:szCs w:val="20"/>
         </w:rPr>
+        <w:lastRenderedPageBreak/>
         <w:t>If Selling Country metadata is missing, blank, or unavailable, this requirement MUST NOT trigger.</w:t>
       </w:r>
     </w:p>
@@ -1880,7 +1933,44 @@
           <w:sz w:val="20"/>
           <w:szCs w:val="20"/>
         </w:rPr>
-        <w:t>If Selling Country metadata is provided, Selling Country metadata takes precedence over inferred country information from the NDA text.</w:t>
+        <w:t>Selling Country metadata is authoritative for Requirement 4 and MUST take precedence over inferred country information from the NDA text.</w:t>
+      </w:r>
+    </w:p>
+    <w:p>
+      <w:pPr>
+        <w:pStyle w:val="ListNumber"/>
+        <w:numPr>
+          <w:ilvl w:val="0"/>
+          <w:numId w:val="0"/>
+        </w:numPr>
+        <w:rPr>
+          <w:rFonts w:ascii="Arial" w:hAnsi="Arial" w:cs="Arial"/>
+          <w:sz w:val="20"/>
+          <w:szCs w:val="20"/>
+        </w:rPr>
+      </w:pPr>
+    </w:p>
+    <w:p>
+      <w:pPr>
+        <w:pStyle w:val="ListNumber"/>
+        <w:numPr>
+          <w:ilvl w:val="0"/>
+          <w:numId w:val="0"/>
+        </w:numPr>
+        <w:ind w:left="360"/>
+        <w:rPr>
+          <w:rFonts w:ascii="Arial" w:hAnsi="Arial" w:cs="Arial"/>
+          <w:sz w:val="20"/>
+          <w:szCs w:val="20"/>
+        </w:rPr>
+      </w:pPr>
+      <w:r>
+        <w:rPr>
+          <w:rFonts w:ascii="Arial" w:hAnsi="Arial" w:cs="Arial"/>
+          <w:sz w:val="20"/>
+          <w:szCs w:val="20"/>
+        </w:rPr>
+        <w:t>If Selling Country metadata is Italy and ANY Trigger Indicator below is present in a clause imposing an obligation, Requirement 4 MUST trigger.</w:t>
       </w:r>
     </w:p>
     <w:p>
@@ -1892,270 +1982,387 @@
           <w:rFonts w:ascii="Arial" w:hAnsi="Arial"/>
           <w:sz w:val="20"/>
         </w:rPr>
+        <w:t>Trigger Indicators</w:t>
+      </w:r>
+    </w:p>
+    <w:p>
+      <w:pPr>
+        <w:pStyle w:val="ListBullet"/>
+        <w:rPr>
+          <w:sz w:val="20"/>
+          <w:szCs w:val="20"/>
+        </w:rPr>
+      </w:pPr>
+      <w:r>
+        <w:rPr>
+          <w:rFonts w:ascii="Arial" w:hAnsi="Arial"/>
+          <w:sz w:val="20"/>
+          <w:szCs w:val="20"/>
+        </w:rPr>
+        <w:t>insider trading</w:t>
+      </w:r>
+    </w:p>
+    <w:p>
+      <w:pPr>
+        <w:pStyle w:val="ListBullet"/>
+        <w:rPr>
+          <w:sz w:val="20"/>
+          <w:szCs w:val="20"/>
+        </w:rPr>
+      </w:pPr>
+      <w:r>
+        <w:rPr>
+          <w:rFonts w:ascii="Arial" w:hAnsi="Arial"/>
+          <w:sz w:val="20"/>
+          <w:szCs w:val="20"/>
+        </w:rPr>
+        <w:t>inside information</w:t>
+      </w:r>
+    </w:p>
+    <w:p>
+      <w:pPr>
+        <w:pStyle w:val="ListBullet"/>
+        <w:rPr>
+          <w:sz w:val="20"/>
+          <w:szCs w:val="20"/>
+        </w:rPr>
+      </w:pPr>
+      <w:r>
+        <w:rPr>
+          <w:rFonts w:ascii="Arial" w:hAnsi="Arial"/>
+          <w:sz w:val="20"/>
+          <w:szCs w:val="20"/>
+        </w:rPr>
+        <w:t>market abuse</w:t>
+      </w:r>
+    </w:p>
+    <w:p>
+      <w:pPr>
+        <w:pStyle w:val="ListBullet"/>
+        <w:rPr>
+          <w:sz w:val="20"/>
+          <w:szCs w:val="20"/>
+        </w:rPr>
+      </w:pPr>
+      <w:r>
+        <w:rPr>
+          <w:rFonts w:ascii="Arial" w:hAnsi="Arial"/>
+          <w:sz w:val="20"/>
+          <w:szCs w:val="20"/>
+        </w:rPr>
+        <w:t>securities laws</w:t>
+      </w:r>
+    </w:p>
+    <w:p>
+      <w:pPr>
+        <w:pStyle w:val="ListBullet"/>
+        <w:rPr>
+          <w:sz w:val="20"/>
+          <w:szCs w:val="20"/>
+        </w:rPr>
+      </w:pPr>
+      <w:r>
+        <w:rPr>
+          <w:rFonts w:ascii="Arial" w:hAnsi="Arial"/>
+          <w:sz w:val="20"/>
+          <w:szCs w:val="20"/>
+        </w:rPr>
+        <w:t>Italian securities laws</w:t>
+      </w:r>
+    </w:p>
+    <w:p>
+      <w:pPr>
+        <w:pStyle w:val="ListBullet"/>
+        <w:rPr>
+          <w:sz w:val="20"/>
+          <w:szCs w:val="20"/>
+        </w:rPr>
+      </w:pPr>
+      <w:r>
+        <w:rPr>
+          <w:rFonts w:ascii="Arial" w:hAnsi="Arial"/>
+          <w:sz w:val="20"/>
+          <w:szCs w:val="20"/>
+        </w:rPr>
+        <w:t>trading restrictions</w:t>
+      </w:r>
+    </w:p>
+    <w:p>
+      <w:pPr>
+        <w:pStyle w:val="ListBullet"/>
+        <w:rPr>
+          <w:sz w:val="20"/>
+          <w:szCs w:val="20"/>
+        </w:rPr>
+      </w:pPr>
+      <w:r>
+        <w:rPr>
+          <w:rFonts w:ascii="Arial" w:hAnsi="Arial"/>
+          <w:sz w:val="20"/>
+          <w:szCs w:val="20"/>
+        </w:rPr>
+        <w:t>market abuse regulation</w:t>
+      </w:r>
+    </w:p>
+    <w:p>
+      <w:pPr>
+        <w:pStyle w:val="ListBullet"/>
+        <w:rPr>
+          <w:rFonts w:ascii="Arial" w:hAnsi="Arial" w:cs="Arial"/>
+          <w:sz w:val="20"/>
+          <w:szCs w:val="20"/>
+        </w:rPr>
+      </w:pPr>
+      <w:r>
+        <w:rPr>
+          <w:rFonts w:ascii="Arial" w:hAnsi="Arial" w:cs="Arial"/>
+          <w:sz w:val="20"/>
+          <w:szCs w:val="20"/>
+        </w:rPr>
+        <w:t>“Regulation (EU) No 596/2014”</w:t>
+      </w:r>
+    </w:p>
+    <w:p>
+      <w:pPr>
+        <w:pStyle w:val="ListBullet"/>
+        <w:rPr>
+          <w:rFonts w:ascii="Arial" w:hAnsi="Arial" w:cs="Arial"/>
+          <w:sz w:val="20"/>
+          <w:szCs w:val="20"/>
+        </w:rPr>
+      </w:pPr>
+      <w:r>
+        <w:rPr>
+          <w:rFonts w:ascii="Arial" w:hAnsi="Arial" w:cs="Arial"/>
+          <w:sz w:val="20"/>
+          <w:szCs w:val="20"/>
+        </w:rPr>
+        <w:t>“Italian Legislative Decree no. 58/1998”</w:t>
+      </w:r>
+    </w:p>
+    <w:p>
+      <w:pPr>
+        <w:pStyle w:val="ListBullet"/>
+        <w:rPr>
+          <w:rFonts w:ascii="Arial" w:hAnsi="Arial" w:cs="Arial"/>
+          <w:sz w:val="20"/>
+          <w:szCs w:val="20"/>
+        </w:rPr>
+      </w:pPr>
+      <w:r>
+        <w:rPr>
+          <w:rFonts w:ascii="Arial" w:hAnsi="Arial" w:cs="Arial"/>
+          <w:sz w:val="20"/>
+          <w:szCs w:val="20"/>
+        </w:rPr>
+        <w:t>“TUF” when used in an insider trading, market abuse, inside information, or securities-law context</w:t>
+      </w:r>
+    </w:p>
+    <w:p>
+      <w:pPr>
+        <w:pStyle w:val="ListBullet"/>
+        <w:rPr>
+          <w:rFonts w:ascii="Arial" w:hAnsi="Arial" w:cs="Arial"/>
+          <w:sz w:val="20"/>
+          <w:szCs w:val="20"/>
+        </w:rPr>
+      </w:pPr>
+      <w:r>
+        <w:rPr>
+          <w:rFonts w:ascii="Arial" w:hAnsi="Arial" w:cs="Arial"/>
+          <w:sz w:val="20"/>
+          <w:szCs w:val="20"/>
+        </w:rPr>
+        <w:t>“MAR” when used in an insider trading, market abuse, inside information, or securities-law context</w:t>
+      </w:r>
+    </w:p>
+    <w:p>
+      <w:pPr>
+        <w:pStyle w:val="Heading2"/>
+      </w:pPr>
+      <w:r>
+        <w:rPr>
+          <w:rFonts w:ascii="Arial" w:hAnsi="Arial"/>
+          <w:sz w:val="20"/>
+        </w:rPr>
+        <w:t>Do Not Trigger</w:t>
+      </w:r>
+    </w:p>
+    <w:p>
+      <w:r>
+        <w:rPr>
+          <w:rFonts w:ascii="Arial" w:hAnsi="Arial"/>
+          <w:sz w:val="20"/>
+        </w:rPr>
+        <w:t>Do not trigger this requirement when:</w:t>
+      </w:r>
+    </w:p>
+    <w:p>
+      <w:pPr>
+        <w:pStyle w:val="ListBullet"/>
+      </w:pPr>
+      <w:r>
+        <w:rPr>
+          <w:rFonts w:ascii="Arial" w:hAnsi="Arial"/>
+          <w:sz w:val="20"/>
+        </w:rPr>
+        <w:t>Only generic confidentiality language exists.</w:t>
+      </w:r>
+    </w:p>
+    <w:p>
+      <w:pPr>
+        <w:pStyle w:val="ListBullet"/>
+      </w:pPr>
+      <w:r>
+        <w:rPr>
+          <w:rFonts w:ascii="Arial" w:hAnsi="Arial"/>
+          <w:sz w:val="20"/>
+        </w:rPr>
+        <w:t xml:space="preserve">Only generic compliance-with-laws language exists without </w:t>
+      </w:r>
+      <w:proofErr w:type="gramStart"/>
+      <w:r>
+        <w:rPr>
+          <w:rFonts w:ascii="Arial" w:hAnsi="Arial"/>
+          <w:sz w:val="20"/>
+        </w:rPr>
+        <w:t>an insider</w:t>
+      </w:r>
+      <w:proofErr w:type="gramEnd"/>
+      <w:r>
+        <w:rPr>
+          <w:rFonts w:ascii="Arial" w:hAnsi="Arial"/>
+          <w:sz w:val="20"/>
+        </w:rPr>
+        <w:t xml:space="preserve"> trading, market abuse, inside information, securities-law, TUF, or MAR signal.</w:t>
+      </w:r>
+    </w:p>
+    <w:p>
+      <w:pPr>
+        <w:pStyle w:val="ListBullet"/>
+      </w:pPr>
+      <w:r>
+        <w:rPr>
+          <w:rFonts w:ascii="Arial" w:hAnsi="Arial"/>
+          <w:sz w:val="20"/>
+        </w:rPr>
+        <w:t>Italy is mentioned only in governing law, addresses, party information, or other document text and Selling Country metadata is not Italy.</w:t>
+      </w:r>
+    </w:p>
+    <w:p>
+      <w:pPr>
+        <w:pStyle w:val="ListBullet"/>
+      </w:pPr>
+      <w:r>
+        <w:rPr>
+          <w:rFonts w:ascii="Arial" w:hAnsi="Arial"/>
+          <w:sz w:val="20"/>
+        </w:rPr>
+        <w:t>Selling Country metadata is provided and is not Italy.</w:t>
+      </w:r>
+    </w:p>
+    <w:p>
+      <w:pPr>
+        <w:pStyle w:val="ListBullet"/>
+      </w:pPr>
+      <w:r>
+        <w:rPr>
+          <w:rFonts w:ascii="Arial" w:hAnsi="Arial"/>
+          <w:sz w:val="20"/>
+        </w:rPr>
+        <w:t>Selling Country metadata is missing, blank, or unavailable.</w:t>
+      </w:r>
+    </w:p>
+    <w:p>
+      <w:pPr>
+        <w:pStyle w:val="Heading2"/>
+      </w:pPr>
+      <w:r>
+        <w:rPr>
+          <w:rFonts w:ascii="Arial" w:hAnsi="Arial"/>
+          <w:sz w:val="20"/>
+        </w:rPr>
+        <w:t>Static Display Text</w:t>
+      </w:r>
+    </w:p>
+    <w:p>
+      <w:r>
+        <w:rPr>
+          <w:rFonts w:ascii="Arial" w:hAnsi="Arial"/>
+          <w:sz w:val="20"/>
+        </w:rPr>
+        <w:t>This NDA includes an insider trading clause and requires legal support for processing.</w:t>
+      </w:r>
+    </w:p>
+    <w:p>
+      <w:pPr>
+        <w:pStyle w:val="Heading1"/>
+      </w:pPr>
+      <w:r>
+        <w:rPr>
+          <w:rFonts w:ascii="Arial" w:hAnsi="Arial"/>
+          <w:sz w:val="20"/>
+        </w:rPr>
+        <w:t>7. Output and Routing Guidance</w:t>
+      </w:r>
+    </w:p>
+    <w:p>
+      <w:r>
+        <w:rPr>
+          <w:rFonts w:ascii="Arial" w:hAnsi="Arial"/>
+          <w:sz w:val="20"/>
+        </w:rPr>
+        <w:t>The Additional Requirements agent must return status = completed when the assessment runs successfully, regardless of whether a requirement is triggered. The status must be failed only when there is an assessment process issue such as unreadable input, invalid input, corrupted text, tool failure, or inability to complete the pre-screening assessment.</w:t>
+      </w:r>
+    </w:p>
+    <w:p>
+      <w:r>
+        <w:rPr>
+          <w:rFonts w:ascii="Arial" w:hAnsi="Arial"/>
+          <w:sz w:val="20"/>
+        </w:rPr>
+        <w:t xml:space="preserve">The </w:t>
+      </w:r>
+      <w:proofErr w:type="spellStart"/>
+      <w:r>
+        <w:rPr>
+          <w:rFonts w:ascii="Arial" w:hAnsi="Arial"/>
+          <w:sz w:val="20"/>
+        </w:rPr>
+        <w:t>pass_to_big_rock_agents</w:t>
+      </w:r>
+      <w:proofErr w:type="spellEnd"/>
+      <w:r>
+        <w:rPr>
+          <w:rFonts w:ascii="Arial" w:hAnsi="Arial"/>
+          <w:sz w:val="20"/>
+        </w:rPr>
+        <w:t xml:space="preserve"> value controls routing. It must be false only when Requirement 1 is false. If Requirement 1 is true, </w:t>
+      </w:r>
+      <w:proofErr w:type="spellStart"/>
+      <w:r>
+        <w:rPr>
+          <w:rFonts w:ascii="Arial" w:hAnsi="Arial"/>
+          <w:sz w:val="20"/>
+        </w:rPr>
+        <w:t>pass_to_big_rock_agents</w:t>
+      </w:r>
+      <w:proofErr w:type="spellEnd"/>
+      <w:r>
+        <w:rPr>
+          <w:rFonts w:ascii="Arial" w:hAnsi="Arial"/>
+          <w:sz w:val="20"/>
+        </w:rPr>
+        <w:t xml:space="preserve"> must be true even if Requirement 2, Requirement 3, or Requirement 4 is triggered.</w:t>
+      </w:r>
+    </w:p>
+    <w:p>
+      <w:r>
+        <w:rPr>
+          <w:rFonts w:ascii="Arial" w:hAnsi="Arial"/>
+          <w:sz w:val="20"/>
+        </w:rPr>
         <w:lastRenderedPageBreak/>
-        <w:t>Trigger Indicators</w:t>
-      </w:r>
-    </w:p>
-    <w:p>
-      <w:pPr>
-        <w:pStyle w:val="ListBullet"/>
-      </w:pPr>
-      <w:r>
-        <w:rPr>
-          <w:rFonts w:ascii="Arial" w:hAnsi="Arial"/>
-          <w:sz w:val="20"/>
-        </w:rPr>
-        <w:t>insider trading</w:t>
-      </w:r>
-    </w:p>
-    <w:p>
-      <w:pPr>
-        <w:pStyle w:val="ListBullet"/>
-      </w:pPr>
-      <w:r>
-        <w:rPr>
-          <w:rFonts w:ascii="Arial" w:hAnsi="Arial"/>
-          <w:sz w:val="20"/>
-        </w:rPr>
-        <w:t>inside information</w:t>
-      </w:r>
-    </w:p>
-    <w:p>
-      <w:pPr>
-        <w:pStyle w:val="ListBullet"/>
-      </w:pPr>
-      <w:r>
-        <w:rPr>
-          <w:rFonts w:ascii="Arial" w:hAnsi="Arial"/>
-          <w:sz w:val="20"/>
-        </w:rPr>
-        <w:t>market abuse</w:t>
-      </w:r>
-    </w:p>
-    <w:p>
-      <w:pPr>
-        <w:pStyle w:val="ListBullet"/>
-      </w:pPr>
-      <w:r>
-        <w:rPr>
-          <w:rFonts w:ascii="Arial" w:hAnsi="Arial"/>
-          <w:sz w:val="20"/>
-        </w:rPr>
-        <w:t>securities laws</w:t>
-      </w:r>
-    </w:p>
-    <w:p>
-      <w:pPr>
-        <w:pStyle w:val="ListBullet"/>
-      </w:pPr>
-      <w:r>
-        <w:rPr>
-          <w:rFonts w:ascii="Arial" w:hAnsi="Arial"/>
-          <w:sz w:val="20"/>
-        </w:rPr>
-        <w:t>Italian securities laws</w:t>
-      </w:r>
-    </w:p>
-    <w:p>
-      <w:pPr>
-        <w:pStyle w:val="ListBullet"/>
-      </w:pPr>
-      <w:r>
-        <w:rPr>
-          <w:rFonts w:ascii="Arial" w:hAnsi="Arial"/>
-          <w:sz w:val="20"/>
-        </w:rPr>
-        <w:t>trading restrictions</w:t>
-      </w:r>
-    </w:p>
-    <w:p>
-      <w:pPr>
-        <w:pStyle w:val="ListBullet"/>
-      </w:pPr>
-      <w:r>
-        <w:rPr>
-          <w:rFonts w:ascii="Arial" w:hAnsi="Arial"/>
-          <w:sz w:val="20"/>
-        </w:rPr>
-        <w:t>market abuse regulation</w:t>
-      </w:r>
-    </w:p>
-    <w:p>
-      <w:pPr>
-        <w:pStyle w:val="Heading2"/>
-      </w:pPr>
-      <w:r>
-        <w:rPr>
-          <w:rFonts w:ascii="Arial" w:hAnsi="Arial"/>
-          <w:sz w:val="20"/>
-        </w:rPr>
-        <w:t>Do Not Trigger</w:t>
-      </w:r>
-    </w:p>
-    <w:p>
-      <w:r>
-        <w:rPr>
-          <w:rFonts w:ascii="Arial" w:hAnsi="Arial"/>
-          <w:sz w:val="20"/>
-        </w:rPr>
-        <w:t>Do not trigger this requirement when:</w:t>
-      </w:r>
-    </w:p>
-    <w:p>
-      <w:pPr>
-        <w:pStyle w:val="ListBullet"/>
-      </w:pPr>
-      <w:r>
-        <w:rPr>
-          <w:rFonts w:ascii="Arial" w:hAnsi="Arial"/>
-          <w:sz w:val="20"/>
-        </w:rPr>
-        <w:t>Only generic confidentiality language exists.</w:t>
-      </w:r>
-    </w:p>
-    <w:p>
-      <w:pPr>
-        <w:pStyle w:val="ListBullet"/>
-      </w:pPr>
-      <w:r>
-        <w:rPr>
-          <w:rFonts w:ascii="Arial" w:hAnsi="Arial"/>
-          <w:sz w:val="20"/>
-        </w:rPr>
-        <w:t>Only generic compliance with laws exists.</w:t>
-      </w:r>
-    </w:p>
-    <w:p>
-      <w:pPr>
-        <w:pStyle w:val="ListBullet"/>
-      </w:pPr>
-      <w:r>
-        <w:rPr>
-          <w:rFonts w:ascii="Arial" w:hAnsi="Arial"/>
-          <w:sz w:val="20"/>
-        </w:rPr>
-        <w:t>Only governing law references exist.</w:t>
-      </w:r>
-    </w:p>
-    <w:p>
-      <w:pPr>
-        <w:pStyle w:val="ListBullet"/>
-      </w:pPr>
-      <w:r>
-        <w:rPr>
-          <w:rFonts w:ascii="Arial" w:hAnsi="Arial"/>
-          <w:sz w:val="20"/>
-        </w:rPr>
-        <w:t>Italy is mentioned without insider trading or securities obligations.</w:t>
-      </w:r>
-    </w:p>
-    <w:p>
-      <w:pPr>
-        <w:pStyle w:val="ListBullet"/>
-        <w:rPr>
-          <w:rFonts w:ascii="Arial" w:hAnsi="Arial" w:cs="Arial"/>
-          <w:sz w:val="20"/>
-          <w:szCs w:val="20"/>
-        </w:rPr>
-      </w:pPr>
-      <w:r>
-        <w:rPr>
-          <w:rFonts w:ascii="Arial" w:hAnsi="Arial" w:cs="Arial"/>
-          <w:sz w:val="20"/>
-          <w:szCs w:val="20"/>
-        </w:rPr>
-        <w:t>Selling Country metadata is provided and is not Italy.</w:t>
-      </w:r>
-    </w:p>
-    <w:p>
-      <w:pPr>
-        <w:pStyle w:val="Heading2"/>
-      </w:pPr>
-      <w:r>
-        <w:rPr>
-          <w:rFonts w:ascii="Arial" w:hAnsi="Arial"/>
-          <w:sz w:val="20"/>
-        </w:rPr>
-        <w:t>Static Display Text</w:t>
-      </w:r>
-    </w:p>
-    <w:p>
-      <w:r>
-        <w:rPr>
-          <w:rFonts w:ascii="Arial" w:hAnsi="Arial"/>
-          <w:sz w:val="20"/>
-        </w:rPr>
-        <w:t>This NDA includes an insider trading clause and requires legal support for processing.</w:t>
-      </w:r>
-    </w:p>
-    <w:p>
-      <w:pPr>
-        <w:pStyle w:val="Heading1"/>
-      </w:pPr>
-      <w:r>
-        <w:rPr>
-          <w:rFonts w:ascii="Arial" w:hAnsi="Arial"/>
-          <w:sz w:val="20"/>
-        </w:rPr>
-        <w:t>7. Output and Routing Guidance</w:t>
-      </w:r>
-    </w:p>
-    <w:p>
-      <w:r>
-        <w:rPr>
-          <w:rFonts w:ascii="Arial" w:hAnsi="Arial"/>
-          <w:sz w:val="20"/>
-        </w:rPr>
-        <w:t>The Additional Requirements agent must return status = completed when the assessment runs successfully, regardless of whether a requirement is triggered. The status must be failed only when there is an assessment process issue such as unreadable input, invalid input, corrupted text, tool failure, or inability to complete the pre-screening assessment.</w:t>
-      </w:r>
-    </w:p>
-    <w:p>
-      <w:r>
-        <w:rPr>
-          <w:rFonts w:ascii="Arial" w:hAnsi="Arial"/>
-          <w:sz w:val="20"/>
-        </w:rPr>
-        <w:t xml:space="preserve">The </w:t>
-      </w:r>
-      <w:proofErr w:type="spellStart"/>
-      <w:r>
-        <w:rPr>
-          <w:rFonts w:ascii="Arial" w:hAnsi="Arial"/>
-          <w:sz w:val="20"/>
-        </w:rPr>
-        <w:t>pass_to_big_rock_agents</w:t>
-      </w:r>
-      <w:proofErr w:type="spellEnd"/>
-      <w:r>
-        <w:rPr>
-          <w:rFonts w:ascii="Arial" w:hAnsi="Arial"/>
-          <w:sz w:val="20"/>
-        </w:rPr>
-        <w:t xml:space="preserve"> value controls routing. It must be false only when Requirement 1 is false. If Requirement 1 is true, </w:t>
-      </w:r>
-      <w:proofErr w:type="spellStart"/>
-      <w:r>
-        <w:rPr>
-          <w:rFonts w:ascii="Arial" w:hAnsi="Arial"/>
-          <w:sz w:val="20"/>
-        </w:rPr>
-        <w:t>pass_to_big_rock_agents</w:t>
-      </w:r>
-      <w:proofErr w:type="spellEnd"/>
-      <w:r>
-        <w:rPr>
-          <w:rFonts w:ascii="Arial" w:hAnsi="Arial"/>
-          <w:sz w:val="20"/>
-        </w:rPr>
-        <w:t xml:space="preserve"> must be true even if Requirement 2, Requirement 3, or Requirement 4 is triggered.</w:t>
-      </w:r>
-    </w:p>
-    <w:p>
-      <w:r>
-        <w:rPr>
-          <w:rFonts w:ascii="Arial" w:hAnsi="Arial"/>
-          <w:sz w:val="20"/>
-        </w:rPr>
         <w:t xml:space="preserve">Requirements 2, 3, and 4 may still return </w:t>
       </w:r>
       <w:proofErr w:type="spellStart"/>
@@ -2458,7 +2665,7 @@
   <w:abstractNum w:abstractNumId="8" w15:restartNumberingAfterBreak="0">
     <w:nsid w:val="FFFFFF89"/>
     <w:multiLevelType w:val="singleLevel"/>
-    <w:tmpl w:val="D1460E56"/>
+    <w:tmpl w:val="5EB84504"/>
     <w:lvl w:ilvl="0">
       <w:start w:val="1"/>
       <w:numFmt w:val="bullet"/>
@@ -13989,6 +14196,67 @@
       </w:tcPr>
     </w:tblStylePr>
   </w:style>
+  <w:style w:type="paragraph" w:styleId="HTMLPreformatted">
+    <w:name w:val="HTML Preformatted"/>
+    <w:basedOn w:val="Normal"/>
+    <w:link w:val="HTMLPreformattedChar"/>
+    <w:uiPriority w:val="99"/>
+    <w:semiHidden/>
+    <w:unhideWhenUsed/>
+    <w:rsid w:val="002653D7"/>
+    <w:pPr>
+      <w:tabs>
+        <w:tab w:val="left" w:pos="916"/>
+        <w:tab w:val="left" w:pos="1832"/>
+        <w:tab w:val="left" w:pos="2748"/>
+        <w:tab w:val="left" w:pos="3664"/>
+        <w:tab w:val="left" w:pos="4580"/>
+        <w:tab w:val="left" w:pos="5496"/>
+        <w:tab w:val="left" w:pos="6412"/>
+        <w:tab w:val="left" w:pos="7328"/>
+        <w:tab w:val="left" w:pos="8244"/>
+        <w:tab w:val="left" w:pos="9160"/>
+        <w:tab w:val="left" w:pos="10076"/>
+        <w:tab w:val="left" w:pos="10992"/>
+        <w:tab w:val="left" w:pos="11908"/>
+        <w:tab w:val="left" w:pos="12824"/>
+        <w:tab w:val="left" w:pos="13740"/>
+        <w:tab w:val="left" w:pos="14656"/>
+      </w:tabs>
+      <w:spacing w:after="0" w:line="240" w:lineRule="auto"/>
+    </w:pPr>
+    <w:rPr>
+      <w:rFonts w:ascii="Courier New" w:eastAsia="Times New Roman" w:hAnsi="Courier New" w:cs="Courier New"/>
+      <w:sz w:val="20"/>
+      <w:szCs w:val="20"/>
+    </w:rPr>
+  </w:style>
+  <w:style w:type="character" w:customStyle="1" w:styleId="HTMLPreformattedChar">
+    <w:name w:val="HTML Preformatted Char"/>
+    <w:basedOn w:val="DefaultParagraphFont"/>
+    <w:link w:val="HTMLPreformatted"/>
+    <w:uiPriority w:val="99"/>
+    <w:semiHidden/>
+    <w:rsid w:val="002653D7"/>
+    <w:rPr>
+      <w:rFonts w:ascii="Courier New" w:eastAsia="Times New Roman" w:hAnsi="Courier New" w:cs="Courier New"/>
+      <w:sz w:val="20"/>
+      <w:szCs w:val="20"/>
+    </w:rPr>
+  </w:style>
+  <w:style w:type="character" w:styleId="HTMLCode">
+    <w:name w:val="HTML Code"/>
+    <w:basedOn w:val="DefaultParagraphFont"/>
+    <w:uiPriority w:val="99"/>
+    <w:semiHidden/>
+    <w:unhideWhenUsed/>
+    <w:rsid w:val="002653D7"/>
+    <w:rPr>
+      <w:rFonts w:ascii="Courier New" w:eastAsia="Times New Roman" w:hAnsi="Courier New" w:cs="Courier New"/>
+      <w:sz w:val="20"/>
+      <w:szCs w:val="20"/>
+    </w:rPr>
+  </w:style>
 </w:styles>
 </file>
 

</xml_diff>

<commit_message>
Update not an NDA requirement for AR KB
</commit_message>
<xml_diff>
--- a/docs/additional_requirements_nda_kb.docx
+++ b/docs/additional_requirements_nda_kb.docx
@@ -28,48 +28,16 @@
           <w:rFonts w:ascii="Arial" w:hAnsi="Arial"/>
           <w:sz w:val="20"/>
         </w:rPr>
-        <w:t xml:space="preserve">Version: Final KB with KB-Driven Non-NDA Contract Type Rules, Updated Routing, and </w:t>
-      </w:r>
-      <w:proofErr w:type="spellStart"/>
-      <w:r>
-        <w:rPr>
-          <w:rFonts w:ascii="Arial" w:hAnsi="Arial"/>
-          <w:sz w:val="20"/>
-        </w:rPr>
-        <w:t>RiskID</w:t>
-      </w:r>
-      <w:proofErr w:type="spellEnd"/>
-      <w:r>
-        <w:rPr>
-          <w:rFonts w:ascii="Arial" w:hAnsi="Arial"/>
-          <w:sz w:val="20"/>
-        </w:rPr>
-        <w:t xml:space="preserve"> 7-9 Mapping</w:t>
-      </w:r>
-    </w:p>
-    <w:p>
-      <w:r>
-        <w:rPr>
-          <w:rFonts w:ascii="Arial" w:hAnsi="Arial"/>
-          <w:sz w:val="20"/>
-        </w:rPr>
-        <w:t xml:space="preserve">Purpose: This Knowledge Base is the source of truth for the Additional Requirements pre-screening agent. It defines the four gatekeeping requirements, stricter document eligibility rules, explicit non-NDA contract type exclusions, multiple-form detection, trigger rules, do-not-trigger rules, static display text, routing guidance, output behavior, and </w:t>
-      </w:r>
-      <w:proofErr w:type="spellStart"/>
-      <w:r>
-        <w:rPr>
-          <w:rFonts w:ascii="Arial" w:hAnsi="Arial"/>
-          <w:sz w:val="20"/>
-        </w:rPr>
-        <w:t>riskID</w:t>
-      </w:r>
-      <w:proofErr w:type="spellEnd"/>
-      <w:r>
-        <w:rPr>
-          <w:rFonts w:ascii="Arial" w:hAnsi="Arial"/>
-          <w:sz w:val="20"/>
-        </w:rPr>
-        <w:t xml:space="preserve"> mapping.</w:t>
+        <w:t>Version: Final KB with KB-Driven Non-NDA Contract Type Rules, Updated Routing, and RiskID 7-9 Mapping</w:t>
+      </w:r>
+    </w:p>
+    <w:p>
+      <w:r>
+        <w:rPr>
+          <w:rFonts w:ascii="Arial" w:hAnsi="Arial"/>
+          <w:sz w:val="20"/>
+        </w:rPr>
+        <w:t>Purpose: This Knowledge Base is the source of truth for the Additional Requirements pre-screening agent. It defines the four gatekeeping requirements, stricter document eligibility rules, explicit non-NDA contract type exclusions, multiple-form detection, trigger rules, do-not-trigger rules, static display text, routing guidance, output behavior, and riskID mapping.</w:t>
       </w:r>
     </w:p>
     <w:p>
@@ -99,39 +67,7 @@
           <w:rFonts w:ascii="Arial" w:hAnsi="Arial"/>
           <w:sz w:val="20"/>
         </w:rPr>
-        <w:t xml:space="preserve">The document may proceed </w:t>
-      </w:r>
-      <w:proofErr w:type="gramStart"/>
-      <w:r>
-        <w:rPr>
-          <w:rFonts w:ascii="Arial" w:hAnsi="Arial"/>
-          <w:sz w:val="20"/>
-        </w:rPr>
-        <w:t>to</w:t>
-      </w:r>
-      <w:proofErr w:type="gramEnd"/>
-      <w:r>
-        <w:rPr>
-          <w:rFonts w:ascii="Arial" w:hAnsi="Arial"/>
-          <w:sz w:val="20"/>
-        </w:rPr>
-        <w:t xml:space="preserve"> the Big Rock Agents if Requirement 1 is true. Requirements 2, 3, and 4 may still be flagged and shown to the user, but they do not block routing to the Big Rock Agents. If Requirement 1 fails, the document must not proceed </w:t>
-      </w:r>
-      <w:proofErr w:type="gramStart"/>
-      <w:r>
-        <w:rPr>
-          <w:rFonts w:ascii="Arial" w:hAnsi="Arial"/>
-          <w:sz w:val="20"/>
-        </w:rPr>
-        <w:t>to</w:t>
-      </w:r>
-      <w:proofErr w:type="gramEnd"/>
-      <w:r>
-        <w:rPr>
-          <w:rFonts w:ascii="Arial" w:hAnsi="Arial"/>
-          <w:sz w:val="20"/>
-        </w:rPr>
-        <w:t xml:space="preserve"> the Big Rock Agents.</w:t>
+        <w:t>The document may proceed to the Big Rock Agents if Requirement 1 is true. Requirements 2, 3, and 4 may still be flagged and shown to the user, but they do not block routing to the Big Rock Agents. If Requirement 1 fails, the document must not proceed to the Big Rock Agents.</w:t>
       </w:r>
     </w:p>
     <w:p>
@@ -143,23 +79,7 @@
           <w:rFonts w:ascii="Arial" w:hAnsi="Arial"/>
           <w:sz w:val="20"/>
         </w:rPr>
-        <w:t xml:space="preserve">2. </w:t>
-      </w:r>
-      <w:proofErr w:type="spellStart"/>
-      <w:r>
-        <w:rPr>
-          <w:rFonts w:ascii="Arial" w:hAnsi="Arial"/>
-          <w:sz w:val="20"/>
-        </w:rPr>
-        <w:t>RiskID</w:t>
-      </w:r>
-      <w:proofErr w:type="spellEnd"/>
-      <w:r>
-        <w:rPr>
-          <w:rFonts w:ascii="Arial" w:hAnsi="Arial"/>
-          <w:sz w:val="20"/>
-        </w:rPr>
-        <w:t xml:space="preserve"> Mapping</w:t>
+        <w:t>2. RiskID Mapping</w:t>
       </w:r>
     </w:p>
     <w:p>
@@ -171,39 +91,7 @@
           <w:rFonts w:ascii="Arial" w:hAnsi="Arial"/>
           <w:sz w:val="20"/>
         </w:rPr>
-        <w:t xml:space="preserve">Requirement 2 uses </w:t>
-      </w:r>
-      <w:proofErr w:type="spellStart"/>
-      <w:r>
-        <w:rPr>
-          <w:rFonts w:ascii="Arial" w:hAnsi="Arial"/>
-          <w:sz w:val="20"/>
-        </w:rPr>
-        <w:t>riskID</w:t>
-      </w:r>
-      <w:proofErr w:type="spellEnd"/>
-      <w:r>
-        <w:rPr>
-          <w:rFonts w:ascii="Arial" w:hAnsi="Arial"/>
-          <w:sz w:val="20"/>
-        </w:rPr>
-        <w:t xml:space="preserve"> "7" and </w:t>
-      </w:r>
-      <w:proofErr w:type="spellStart"/>
-      <w:r>
-        <w:rPr>
-          <w:rFonts w:ascii="Arial" w:hAnsi="Arial"/>
-          <w:sz w:val="20"/>
-        </w:rPr>
-        <w:t>riskName</w:t>
-      </w:r>
-      <w:proofErr w:type="spellEnd"/>
-      <w:r>
-        <w:rPr>
-          <w:rFonts w:ascii="Arial" w:hAnsi="Arial"/>
-          <w:sz w:val="20"/>
-        </w:rPr>
-        <w:t xml:space="preserve"> "NDA's Between Accenture Employees and Clients".</w:t>
+        <w:t>Requirement 2 uses riskID "7" and riskName "NDA's Between Accenture Employees and Clients".</w:t>
       </w:r>
     </w:p>
     <w:p>
@@ -215,39 +103,7 @@
           <w:rFonts w:ascii="Arial" w:hAnsi="Arial"/>
           <w:sz w:val="20"/>
         </w:rPr>
-        <w:t xml:space="preserve">Requirement 3 uses </w:t>
-      </w:r>
-      <w:proofErr w:type="spellStart"/>
-      <w:r>
-        <w:rPr>
-          <w:rFonts w:ascii="Arial" w:hAnsi="Arial"/>
-          <w:sz w:val="20"/>
-        </w:rPr>
-        <w:t>riskID</w:t>
-      </w:r>
-      <w:proofErr w:type="spellEnd"/>
-      <w:r>
-        <w:rPr>
-          <w:rFonts w:ascii="Arial" w:hAnsi="Arial"/>
-          <w:sz w:val="20"/>
-        </w:rPr>
-        <w:t xml:space="preserve"> "8" and </w:t>
-      </w:r>
-      <w:proofErr w:type="spellStart"/>
-      <w:r>
-        <w:rPr>
-          <w:rFonts w:ascii="Arial" w:hAnsi="Arial"/>
-          <w:sz w:val="20"/>
-        </w:rPr>
-        <w:t>riskName</w:t>
-      </w:r>
-      <w:proofErr w:type="spellEnd"/>
-      <w:r>
-        <w:rPr>
-          <w:rFonts w:ascii="Arial" w:hAnsi="Arial"/>
-          <w:sz w:val="20"/>
-        </w:rPr>
-        <w:t xml:space="preserve"> "Signature Formality (For Contracting in Australia and New Zealand)".</w:t>
+        <w:t>Requirement 3 uses riskID "8" and riskName "Signature Formality (For Contracting in Australia and New Zealand)".</w:t>
       </w:r>
     </w:p>
     <w:p>
@@ -259,39 +115,7 @@
           <w:rFonts w:ascii="Arial" w:hAnsi="Arial"/>
           <w:sz w:val="20"/>
         </w:rPr>
-        <w:t xml:space="preserve">Requirement 4 uses </w:t>
-      </w:r>
-      <w:proofErr w:type="spellStart"/>
-      <w:r>
-        <w:rPr>
-          <w:rFonts w:ascii="Arial" w:hAnsi="Arial"/>
-          <w:sz w:val="20"/>
-        </w:rPr>
-        <w:t>riskID</w:t>
-      </w:r>
-      <w:proofErr w:type="spellEnd"/>
-      <w:r>
-        <w:rPr>
-          <w:rFonts w:ascii="Arial" w:hAnsi="Arial"/>
-          <w:sz w:val="20"/>
-        </w:rPr>
-        <w:t xml:space="preserve"> "9" and </w:t>
-      </w:r>
-      <w:proofErr w:type="spellStart"/>
-      <w:r>
-        <w:rPr>
-          <w:rFonts w:ascii="Arial" w:hAnsi="Arial"/>
-          <w:sz w:val="20"/>
-        </w:rPr>
-        <w:t>riskName</w:t>
-      </w:r>
-      <w:proofErr w:type="spellEnd"/>
-      <w:r>
-        <w:rPr>
-          <w:rFonts w:ascii="Arial" w:hAnsi="Arial"/>
-          <w:sz w:val="20"/>
-        </w:rPr>
-        <w:t xml:space="preserve"> "Insider Trading (For Contracting in Italy)".</w:t>
+        <w:t>Requirement 4 uses riskID "9" and riskName "Insider Trading (For Contracting in Italy)".</w:t>
       </w:r>
     </w:p>
     <w:p>
@@ -345,23 +169,7 @@
           <w:rFonts w:ascii="Arial" w:hAnsi="Arial"/>
           <w:sz w:val="20"/>
         </w:rPr>
-        <w:t xml:space="preserve">Treat the document as eligible only if </w:t>
-      </w:r>
-      <w:proofErr w:type="gramStart"/>
-      <w:r>
-        <w:rPr>
-          <w:rFonts w:ascii="Arial" w:hAnsi="Arial"/>
-          <w:sz w:val="20"/>
-        </w:rPr>
-        <w:t>ALL of</w:t>
-      </w:r>
-      <w:proofErr w:type="gramEnd"/>
-      <w:r>
-        <w:rPr>
-          <w:rFonts w:ascii="Arial" w:hAnsi="Arial"/>
-          <w:sz w:val="20"/>
-        </w:rPr>
-        <w:t xml:space="preserve"> the following are true:</w:t>
+        <w:t>Treat the document as eligible only if ALL of the following are true:</w:t>
       </w:r>
     </w:p>
     <w:p>
@@ -483,7 +291,6 @@
       <w:pPr>
         <w:pStyle w:val="ListBullet"/>
       </w:pPr>
-      <w:proofErr w:type="gramStart"/>
       <w:r>
         <w:rPr>
           <w:rFonts w:ascii="Arial" w:hAnsi="Arial"/>
@@ -491,7 +298,6 @@
         </w:rPr>
         <w:t>Statement of Work</w:t>
       </w:r>
-      <w:proofErr w:type="gramEnd"/>
     </w:p>
     <w:p>
       <w:pPr>
@@ -848,13 +654,18 @@
     <w:p>
       <w:pPr>
         <w:pStyle w:val="ListBullet"/>
-      </w:pPr>
-      <w:r>
-        <w:rPr>
-          <w:rFonts w:ascii="Arial" w:hAnsi="Arial"/>
-          <w:sz w:val="20"/>
-        </w:rPr>
-        <w:t>Repeated full NDA structures separated by page breaks, dividers, schedules, annexes, appendices, or attachments.</w:t>
+        <w:rPr>
+          <w:rFonts w:ascii="Arial" w:hAnsi="Arial" w:cs="Arial"/>
+          <w:sz w:val="20"/>
+          <w:szCs w:val="20"/>
+        </w:rPr>
+      </w:pPr>
+      <w:r>
+        <w:rPr>
+          <w:rFonts w:ascii="Arial" w:hAnsi="Arial"/>
+          <w:sz w:val="20"/>
+        </w:rPr>
+        <w:t>Repeated full NDA structures separated by page breaks, dividers, schedules, annexes, appendices, or attachments, where the repeated structures are supported by clear evidence that they constitute separate standalone agreements.</w:t>
       </w:r>
     </w:p>
     <w:p>
@@ -977,11 +788,71 @@
     <w:p>
       <w:pPr>
         <w:pStyle w:val="ListBullet"/>
-      </w:pPr>
-      <w:r>
-        <w:rPr>
-          <w:rFonts w:ascii="Arial" w:hAnsi="Arial"/>
-          <w:sz w:val="20"/>
+        <w:rPr>
+          <w:rFonts w:ascii="Arial" w:hAnsi="Arial" w:cs="Arial"/>
+          <w:sz w:val="20"/>
+          <w:szCs w:val="20"/>
+        </w:rPr>
+      </w:pPr>
+      <w:r>
+        <w:rPr>
+          <w:rFonts w:ascii="Arial" w:hAnsi="Arial" w:cs="Arial"/>
+          <w:sz w:val="20"/>
+          <w:szCs w:val="20"/>
+        </w:rPr>
+        <w:t>The document contains substantially identical or duplicate NDA text repeated within the same upload, but there is no clear structural evidence that the repeated content represents separate standalone agreements.</w:t>
+      </w:r>
+    </w:p>
+    <w:p>
+      <w:pPr>
+        <w:pStyle w:val="ListBullet"/>
+        <w:rPr>
+          <w:rFonts w:ascii="Arial" w:hAnsi="Arial" w:cs="Arial"/>
+          <w:sz w:val="20"/>
+          <w:szCs w:val="20"/>
+        </w:rPr>
+      </w:pPr>
+      <w:r>
+        <w:rPr>
+          <w:rFonts w:ascii="Arial" w:hAnsi="Arial" w:cs="Arial"/>
+          <w:sz w:val="20"/>
+          <w:szCs w:val="20"/>
+        </w:rPr>
+        <w:t>Do not infer multiple standalone NDA forms solely from repeated NDA titles combined with repeated identical confidentiality obligations or substantially identical agreement text.</w:t>
+      </w:r>
+    </w:p>
+    <w:p>
+      <w:pPr>
+        <w:pStyle w:val="ListBullet"/>
+        <w:rPr>
+          <w:rFonts w:ascii="Arial" w:hAnsi="Arial" w:cs="Arial"/>
+          <w:sz w:val="20"/>
+          <w:szCs w:val="20"/>
+        </w:rPr>
+      </w:pPr>
+      <w:r>
+        <w:rPr>
+          <w:rFonts w:ascii="Arial" w:hAnsi="Arial" w:cs="Arial"/>
+          <w:sz w:val="20"/>
+          <w:szCs w:val="20"/>
+        </w:rPr>
+        <w:t>Repeated full NDA text or repeated NDA sections must not, by itself, be treated as evidence of multiple standalone NDA forms. Repetition should trigger this rule only when accompanied by clear structural evidence that the repeated content represents separate agreements, such as independent party blocks, effective dates, signature or execution blocks, governing law provisions, or other agreement-level identifiers.</w:t>
+      </w:r>
+    </w:p>
+    <w:p>
+      <w:pPr>
+        <w:pStyle w:val="ListBullet"/>
+        <w:rPr>
+          <w:rFonts w:ascii="Arial" w:hAnsi="Arial" w:cs="Arial"/>
+          <w:sz w:val="20"/>
+          <w:szCs w:val="20"/>
+        </w:rPr>
+      </w:pPr>
+      <w:r>
+        <w:rPr>
+          <w:rFonts w:ascii="Arial" w:hAnsi="Arial" w:cs="Arial"/>
+          <w:sz w:val="20"/>
+          <w:szCs w:val="20"/>
         </w:rPr>
         <w:t>The evidence is ambiguous.</w:t>
       </w:r>
@@ -995,6 +866,7 @@
           <w:rFonts w:ascii="Arial" w:hAnsi="Arial"/>
           <w:sz w:val="20"/>
         </w:rPr>
+        <w:lastRenderedPageBreak/>
         <w:t>Fail Conditions</w:t>
       </w:r>
     </w:p>
@@ -1076,36 +948,200 @@
           <w:rFonts w:ascii="Arial" w:hAnsi="Arial"/>
           <w:sz w:val="20"/>
         </w:rPr>
+        <w:t>Static Display Text</w:t>
+      </w:r>
+    </w:p>
+    <w:p>
+      <w:r>
+        <w:rPr>
+          <w:rFonts w:ascii="Arial" w:hAnsi="Arial"/>
+          <w:sz w:val="20"/>
+        </w:rPr>
+        <w:t>The uploaded document is not an NDA or eligible NDA risk review document. Please upload an NDA or change the Contract Type in Deal Shape to proceed.</w:t>
+      </w:r>
+    </w:p>
+    <w:p>
+      <w:pPr>
+        <w:pStyle w:val="Heading1"/>
+      </w:pPr>
+      <w:r>
+        <w:rPr>
+          <w:rFonts w:ascii="Arial" w:hAnsi="Arial"/>
+          <w:sz w:val="20"/>
+        </w:rPr>
+        <w:t>4. Requirement 2: NDA's Between Accenture Employees and Clients</w:t>
+      </w:r>
+    </w:p>
+    <w:p>
+      <w:pPr>
+        <w:pStyle w:val="Heading2"/>
+      </w:pPr>
+      <w:r>
+        <w:rPr>
+          <w:rFonts w:ascii="Arial" w:hAnsi="Arial"/>
+          <w:sz w:val="20"/>
+        </w:rPr>
+        <w:t>RiskID</w:t>
+      </w:r>
+    </w:p>
+    <w:p>
+      <w:r>
+        <w:rPr>
+          <w:rFonts w:ascii="Arial" w:hAnsi="Arial"/>
+          <w:sz w:val="20"/>
+        </w:rPr>
+        <w:t>7</w:t>
+      </w:r>
+    </w:p>
+    <w:p>
+      <w:pPr>
+        <w:pStyle w:val="Heading2"/>
+      </w:pPr>
+      <w:r>
+        <w:rPr>
+          <w:rFonts w:ascii="Arial" w:hAnsi="Arial"/>
+          <w:sz w:val="20"/>
+        </w:rPr>
+        <w:t>Trigger Rule</w:t>
+      </w:r>
+    </w:p>
+    <w:p>
+      <w:r>
+        <w:rPr>
+          <w:rFonts w:ascii="Arial" w:hAnsi="Arial"/>
+          <w:sz w:val="20"/>
+        </w:rPr>
+        <w:t>Trigger this requirement only when the NDA clearly shows that the agreement is between a client and an individual person, Accenture employee, contractor, or representative acting in a personal capacity, rather than Accenture as a legal entity.</w:t>
+      </w:r>
+    </w:p>
+    <w:p>
+      <w:r>
+        <w:rPr>
+          <w:rFonts w:ascii="Arial" w:hAnsi="Arial"/>
+          <w:sz w:val="20"/>
+        </w:rPr>
+        <w:t>This requirement must only trigger when the individual personal-capacity relationship is unambiguous.</w:t>
+      </w:r>
+    </w:p>
+    <w:p>
+      <w:pPr>
+        <w:pStyle w:val="Heading2"/>
+      </w:pPr>
+      <w:r>
+        <w:rPr>
+          <w:rFonts w:ascii="Arial" w:hAnsi="Arial"/>
+          <w:sz w:val="20"/>
+        </w:rPr>
+        <w:t>Do Not Trigger</w:t>
+      </w:r>
+    </w:p>
+    <w:p>
+      <w:r>
+        <w:rPr>
+          <w:rFonts w:ascii="Arial" w:hAnsi="Arial"/>
+          <w:sz w:val="20"/>
+        </w:rPr>
+        <w:t>Do not trigger this requirement when:</w:t>
+      </w:r>
+    </w:p>
+    <w:p>
+      <w:pPr>
+        <w:pStyle w:val="ListBullet"/>
+      </w:pPr>
+      <w:r>
+        <w:rPr>
+          <w:rFonts w:ascii="Arial" w:hAnsi="Arial"/>
+          <w:sz w:val="20"/>
+        </w:rPr>
+        <w:t>The parties are unclear.</w:t>
+      </w:r>
+    </w:p>
+    <w:p>
+      <w:pPr>
+        <w:pStyle w:val="ListBullet"/>
+      </w:pPr>
+      <w:r>
+        <w:rPr>
+          <w:rFonts w:ascii="Arial" w:hAnsi="Arial"/>
+          <w:sz w:val="20"/>
+        </w:rPr>
+        <w:t>The agreement is between corporate entities.</w:t>
+      </w:r>
+    </w:p>
+    <w:p>
+      <w:pPr>
+        <w:pStyle w:val="ListBullet"/>
+      </w:pPr>
+      <w:r>
+        <w:rPr>
+          <w:rFonts w:ascii="Arial" w:hAnsi="Arial"/>
+          <w:sz w:val="20"/>
+        </w:rPr>
+        <w:t>The individual is only signing as an authorized representative.</w:t>
+      </w:r>
+    </w:p>
+    <w:p>
+      <w:pPr>
+        <w:pStyle w:val="ListBullet"/>
+      </w:pPr>
+      <w:r>
+        <w:rPr>
+          <w:rFonts w:ascii="Arial" w:hAnsi="Arial"/>
+          <w:sz w:val="20"/>
+        </w:rPr>
+        <w:t>The individual is signing on behalf of Accenture or another legal entity.</w:t>
+      </w:r>
+    </w:p>
+    <w:p>
+      <w:pPr>
+        <w:pStyle w:val="ListBullet"/>
+      </w:pPr>
+      <w:r>
+        <w:rPr>
+          <w:rFonts w:ascii="Arial" w:hAnsi="Arial"/>
+          <w:sz w:val="20"/>
+        </w:rPr>
+        <w:t>The evidence is ambiguous.</w:t>
+      </w:r>
+    </w:p>
+    <w:p>
+      <w:pPr>
+        <w:pStyle w:val="Heading2"/>
+      </w:pPr>
+      <w:r>
+        <w:rPr>
+          <w:rFonts w:ascii="Arial" w:hAnsi="Arial"/>
+          <w:sz w:val="20"/>
+        </w:rPr>
+        <w:t>Static Display Text</w:t>
+      </w:r>
+    </w:p>
+    <w:p>
+      <w:r>
+        <w:rPr>
+          <w:rFonts w:ascii="Arial" w:hAnsi="Arial"/>
+          <w:sz w:val="20"/>
+        </w:rPr>
+        <w:t>This NDA has been flagged to be signed between the Client and an individual person (e.g. an employee or representative but not Accenture as an entity). Note that Accenture does not expect this type of NDAs to be signed as it may carry direct personal liability for the signatory with the Client. If your intent is to request the legal review of an NDA between an employee and the Client, please proceed to request legal support. If your intent is to sign a regular NDA between Accenture and the Client, please delete the uploaded document and upload a new version of the NDA that is between the Client and Accenture.</w:t>
+      </w:r>
+    </w:p>
+    <w:p>
+      <w:pPr>
+        <w:pStyle w:val="Heading1"/>
+      </w:pPr>
+      <w:r>
+        <w:rPr>
+          <w:rFonts w:ascii="Arial" w:hAnsi="Arial"/>
+          <w:sz w:val="20"/>
+        </w:rPr>
         <w:lastRenderedPageBreak/>
-        <w:t>Static Display Text</w:t>
-      </w:r>
-    </w:p>
-    <w:p>
-      <w:r>
-        <w:rPr>
-          <w:rFonts w:ascii="Arial" w:hAnsi="Arial"/>
-          <w:sz w:val="20"/>
-        </w:rPr>
-        <w:t>The uploaded document is not an NDA or eligible NDA risk review document. Please upload an NDA or change the Contract Type in Deal Shape to proceed.</w:t>
-      </w:r>
-    </w:p>
-    <w:p>
-      <w:pPr>
-        <w:pStyle w:val="Heading1"/>
-      </w:pPr>
-      <w:r>
-        <w:rPr>
-          <w:rFonts w:ascii="Arial" w:hAnsi="Arial"/>
-          <w:sz w:val="20"/>
-        </w:rPr>
-        <w:t>4. Requirement 2: NDA's Between Accenture Employees and Clients</w:t>
+        <w:t>5. Requirement 3: Signature Formality (For Contracting in Australia and New Zealand)</w:t>
       </w:r>
     </w:p>
     <w:p>
       <w:pPr>
         <w:pStyle w:val="Heading2"/>
       </w:pPr>
-      <w:proofErr w:type="spellStart"/>
       <w:r>
         <w:rPr>
           <w:rFonts w:ascii="Arial" w:hAnsi="Arial"/>
@@ -1113,174 +1149,6 @@
         </w:rPr>
         <w:t>RiskID</w:t>
       </w:r>
-      <w:proofErr w:type="spellEnd"/>
-    </w:p>
-    <w:p>
-      <w:r>
-        <w:rPr>
-          <w:rFonts w:ascii="Arial" w:hAnsi="Arial"/>
-          <w:sz w:val="20"/>
-        </w:rPr>
-        <w:t>7</w:t>
-      </w:r>
-    </w:p>
-    <w:p>
-      <w:pPr>
-        <w:pStyle w:val="Heading2"/>
-      </w:pPr>
-      <w:r>
-        <w:rPr>
-          <w:rFonts w:ascii="Arial" w:hAnsi="Arial"/>
-          <w:sz w:val="20"/>
-        </w:rPr>
-        <w:t>Trigger Rule</w:t>
-      </w:r>
-    </w:p>
-    <w:p>
-      <w:r>
-        <w:rPr>
-          <w:rFonts w:ascii="Arial" w:hAnsi="Arial"/>
-          <w:sz w:val="20"/>
-        </w:rPr>
-        <w:t>Trigger this requirement only when the NDA clearly shows that the agreement is between a client and an individual person, Accenture employee, contractor, or representative acting in a personal capacity, rather than Accenture as a legal entity.</w:t>
-      </w:r>
-    </w:p>
-    <w:p>
-      <w:r>
-        <w:rPr>
-          <w:rFonts w:ascii="Arial" w:hAnsi="Arial"/>
-          <w:sz w:val="20"/>
-        </w:rPr>
-        <w:t>This requirement must only trigger when the individual personal-capacity relationship is unambiguous.</w:t>
-      </w:r>
-    </w:p>
-    <w:p>
-      <w:pPr>
-        <w:pStyle w:val="Heading2"/>
-      </w:pPr>
-      <w:r>
-        <w:rPr>
-          <w:rFonts w:ascii="Arial" w:hAnsi="Arial"/>
-          <w:sz w:val="20"/>
-        </w:rPr>
-        <w:t>Do Not Trigger</w:t>
-      </w:r>
-    </w:p>
-    <w:p>
-      <w:r>
-        <w:rPr>
-          <w:rFonts w:ascii="Arial" w:hAnsi="Arial"/>
-          <w:sz w:val="20"/>
-        </w:rPr>
-        <w:t>Do not trigger this requirement when:</w:t>
-      </w:r>
-    </w:p>
-    <w:p>
-      <w:pPr>
-        <w:pStyle w:val="ListBullet"/>
-      </w:pPr>
-      <w:r>
-        <w:rPr>
-          <w:rFonts w:ascii="Arial" w:hAnsi="Arial"/>
-          <w:sz w:val="20"/>
-        </w:rPr>
-        <w:t>The parties are unclear.</w:t>
-      </w:r>
-    </w:p>
-    <w:p>
-      <w:pPr>
-        <w:pStyle w:val="ListBullet"/>
-      </w:pPr>
-      <w:r>
-        <w:rPr>
-          <w:rFonts w:ascii="Arial" w:hAnsi="Arial"/>
-          <w:sz w:val="20"/>
-        </w:rPr>
-        <w:t>The agreement is between corporate entities.</w:t>
-      </w:r>
-    </w:p>
-    <w:p>
-      <w:pPr>
-        <w:pStyle w:val="ListBullet"/>
-      </w:pPr>
-      <w:r>
-        <w:rPr>
-          <w:rFonts w:ascii="Arial" w:hAnsi="Arial"/>
-          <w:sz w:val="20"/>
-        </w:rPr>
-        <w:t>The individual is only signing as an authorized representative.</w:t>
-      </w:r>
-    </w:p>
-    <w:p>
-      <w:pPr>
-        <w:pStyle w:val="ListBullet"/>
-      </w:pPr>
-      <w:r>
-        <w:rPr>
-          <w:rFonts w:ascii="Arial" w:hAnsi="Arial"/>
-          <w:sz w:val="20"/>
-        </w:rPr>
-        <w:t>The individual is signing on behalf of Accenture or another legal entity.</w:t>
-      </w:r>
-    </w:p>
-    <w:p>
-      <w:pPr>
-        <w:pStyle w:val="ListBullet"/>
-      </w:pPr>
-      <w:r>
-        <w:rPr>
-          <w:rFonts w:ascii="Arial" w:hAnsi="Arial"/>
-          <w:sz w:val="20"/>
-        </w:rPr>
-        <w:t>The evidence is ambiguous.</w:t>
-      </w:r>
-    </w:p>
-    <w:p>
-      <w:pPr>
-        <w:pStyle w:val="Heading2"/>
-      </w:pPr>
-      <w:r>
-        <w:rPr>
-          <w:rFonts w:ascii="Arial" w:hAnsi="Arial"/>
-          <w:sz w:val="20"/>
-        </w:rPr>
-        <w:t>Static Display Text</w:t>
-      </w:r>
-    </w:p>
-    <w:p>
-      <w:r>
-        <w:rPr>
-          <w:rFonts w:ascii="Arial" w:hAnsi="Arial"/>
-          <w:sz w:val="20"/>
-        </w:rPr>
-        <w:t>This NDA has been flagged to be signed between the Client and an individual person (e.g. an employee or representative but not Accenture as an entity). Note that Accenture does not expect this type of NDAs to be signed as it may carry direct personal liability for the signatory with the Client. If your intent is to request the legal review of an NDA between an employee and the Client, please proceed to request legal support. If your intent is to sign a regular NDA between Accenture and the Client, please delete the uploaded document and upload a new version of the NDA that is between the Client and Accenture.</w:t>
-      </w:r>
-    </w:p>
-    <w:p>
-      <w:pPr>
-        <w:pStyle w:val="Heading1"/>
-      </w:pPr>
-      <w:r>
-        <w:rPr>
-          <w:rFonts w:ascii="Arial" w:hAnsi="Arial"/>
-          <w:sz w:val="20"/>
-        </w:rPr>
-        <w:t>5. Requirement 3: Signature Formality (For Contracting in Australia and New Zealand)</w:t>
-      </w:r>
-    </w:p>
-    <w:p>
-      <w:pPr>
-        <w:pStyle w:val="Heading2"/>
-      </w:pPr>
-      <w:proofErr w:type="spellStart"/>
-      <w:r>
-        <w:rPr>
-          <w:rFonts w:ascii="Arial" w:hAnsi="Arial"/>
-          <w:sz w:val="20"/>
-        </w:rPr>
-        <w:t>RiskID</w:t>
-      </w:r>
-      <w:proofErr w:type="spellEnd"/>
     </w:p>
     <w:p>
       <w:r>
@@ -1365,7 +1233,6 @@
           <w:sz w:val="20"/>
           <w:szCs w:val="20"/>
         </w:rPr>
-        <w:lastRenderedPageBreak/>
         <w:t>If Selling Country metadata is provided and the value is not Australia or New Zealand, this requirement MUST NOT trigger regardless of deed-related language.</w:t>
       </w:r>
     </w:p>
@@ -1515,23 +1382,7 @@
           <w:rFonts w:ascii="Arial" w:hAnsi="Arial"/>
           <w:sz w:val="20"/>
         </w:rPr>
-        <w:t>“</w:t>
-      </w:r>
-      <w:proofErr w:type="gramStart"/>
-      <w:r>
-        <w:rPr>
-          <w:rFonts w:ascii="Arial" w:hAnsi="Arial"/>
-          <w:sz w:val="20"/>
-        </w:rPr>
-        <w:t>signed</w:t>
-      </w:r>
-      <w:proofErr w:type="gramEnd"/>
-      <w:r>
-        <w:rPr>
-          <w:rFonts w:ascii="Arial" w:hAnsi="Arial"/>
-          <w:sz w:val="20"/>
-        </w:rPr>
-        <w:t>, sealed and delivered” when accompanied by express deed-execution language or when the document otherwise clearly identifies itself as a deed</w:t>
+        <w:t>“signed, sealed and delivered” when accompanied by express deed-execution language or when the document otherwise clearly identifies itself as a deed</w:t>
       </w:r>
     </w:p>
     <w:p>
@@ -1636,25 +1487,7 @@
           <w:sz w:val="20"/>
           <w:szCs w:val="20"/>
         </w:rPr>
-        <w:t xml:space="preserve">Do NOT trigger where the execution block </w:t>
-      </w:r>
-      <w:proofErr w:type="gramStart"/>
-      <w:r>
-        <w:rPr>
-          <w:rFonts w:ascii="Arial" w:hAnsi="Arial" w:cs="Arial"/>
-          <w:sz w:val="20"/>
-          <w:szCs w:val="20"/>
-        </w:rPr>
-        <w:t>states</w:t>
-      </w:r>
-      <w:proofErr w:type="gramEnd"/>
-      <w:r>
-        <w:rPr>
-          <w:rFonts w:ascii="Arial" w:hAnsi="Arial" w:cs="Arial"/>
-          <w:sz w:val="20"/>
-          <w:szCs w:val="20"/>
-        </w:rPr>
-        <w:t xml:space="preserve"> “Executed as an Agreement” and the document does not expressly require execution as a deed.</w:t>
+        <w:t>Do NOT trigger where the execution block states “Executed as an Agreement” and the document does not expressly require execution as a deed.</w:t>
       </w:r>
     </w:p>
     <w:p>
@@ -1703,23 +1536,7 @@
           <w:rFonts w:ascii="Arial" w:hAnsi="Arial"/>
           <w:sz w:val="20"/>
         </w:rPr>
-        <w:t xml:space="preserve">This NDA requires </w:t>
-      </w:r>
-      <w:proofErr w:type="gramStart"/>
-      <w:r>
-        <w:rPr>
-          <w:rFonts w:ascii="Arial" w:hAnsi="Arial"/>
-          <w:sz w:val="20"/>
-        </w:rPr>
-        <w:t>signature</w:t>
-      </w:r>
-      <w:proofErr w:type="gramEnd"/>
-      <w:r>
-        <w:rPr>
-          <w:rFonts w:ascii="Arial" w:hAnsi="Arial"/>
-          <w:sz w:val="20"/>
-        </w:rPr>
-        <w:t xml:space="preserve"> by deed and requires legal support for processing.</w:t>
+        <w:t>This NDA requires signature by deed and requires legal support for processing.</w:t>
       </w:r>
     </w:p>
     <w:p>
@@ -1738,7 +1555,6 @@
       <w:pPr>
         <w:pStyle w:val="Heading2"/>
       </w:pPr>
-      <w:proofErr w:type="spellStart"/>
       <w:r>
         <w:rPr>
           <w:rFonts w:ascii="Arial" w:hAnsi="Arial"/>
@@ -1746,7 +1562,6 @@
         </w:rPr>
         <w:t>RiskID</w:t>
       </w:r>
-      <w:proofErr w:type="spellEnd"/>
     </w:p>
     <w:p>
       <w:r>
@@ -1766,6 +1581,7 @@
           <w:rFonts w:ascii="Arial" w:hAnsi="Arial"/>
           <w:sz w:val="20"/>
         </w:rPr>
+        <w:lastRenderedPageBreak/>
         <w:t>Trigger Rule</w:t>
       </w:r>
     </w:p>
@@ -1807,15 +1623,7 @@
           <w:rFonts w:ascii="Arial" w:hAnsi="Arial"/>
           <w:sz w:val="20"/>
         </w:rPr>
-        <w:t xml:space="preserve">The NDA contains at least one clear insider trading, market abuse, inside information, or securities-law </w:t>
-      </w:r>
-      <w:proofErr w:type="gramStart"/>
-      <w:r>
-        <w:rPr>
-          <w:rFonts w:ascii="Arial" w:hAnsi="Arial"/>
-          <w:sz w:val="20"/>
-        </w:rPr>
-        <w:t>obligation.</w:t>
+        <w:t>The NDA contains at least one clear insider trading, market abuse, inside information, or securities-law obligation.</w:t>
       </w:r>
       <w:r>
         <w:rPr>
@@ -1824,7 +1632,6 @@
         </w:rPr>
         <w:t>.</w:t>
       </w:r>
-      <w:proofErr w:type="gramEnd"/>
     </w:p>
     <w:p>
       <w:pPr>
@@ -1894,7 +1701,6 @@
           <w:sz w:val="20"/>
           <w:szCs w:val="20"/>
         </w:rPr>
-        <w:lastRenderedPageBreak/>
         <w:t>If Selling Country metadata is missing, blank, or unavailable, this requirement MUST NOT trigger.</w:t>
       </w:r>
     </w:p>
@@ -2218,23 +2024,7 @@
           <w:rFonts w:ascii="Arial" w:hAnsi="Arial"/>
           <w:sz w:val="20"/>
         </w:rPr>
-        <w:t xml:space="preserve">Only generic compliance-with-laws language exists without </w:t>
-      </w:r>
-      <w:proofErr w:type="gramStart"/>
-      <w:r>
-        <w:rPr>
-          <w:rFonts w:ascii="Arial" w:hAnsi="Arial"/>
-          <w:sz w:val="20"/>
-        </w:rPr>
-        <w:t>an insider</w:t>
-      </w:r>
-      <w:proofErr w:type="gramEnd"/>
-      <w:r>
-        <w:rPr>
-          <w:rFonts w:ascii="Arial" w:hAnsi="Arial"/>
-          <w:sz w:val="20"/>
-        </w:rPr>
-        <w:t xml:space="preserve"> trading, market abuse, inside information, securities-law, TUF, or MAR signal.</w:t>
+        <w:t>Only generic compliance-with-laws language exists without an insider trading, market abuse, inside information, securities-law, TUF, or MAR signal.</w:t>
       </w:r>
     </w:p>
     <w:p>
@@ -2303,6 +2093,7 @@
           <w:rFonts w:ascii="Arial" w:hAnsi="Arial"/>
           <w:sz w:val="20"/>
         </w:rPr>
+        <w:lastRenderedPageBreak/>
         <w:t>7. Output and Routing Guidance</w:t>
       </w:r>
     </w:p>
@@ -2321,65 +2112,16 @@
           <w:rFonts w:ascii="Arial" w:hAnsi="Arial"/>
           <w:sz w:val="20"/>
         </w:rPr>
-        <w:t xml:space="preserve">The </w:t>
-      </w:r>
-      <w:proofErr w:type="spellStart"/>
-      <w:r>
-        <w:rPr>
-          <w:rFonts w:ascii="Arial" w:hAnsi="Arial"/>
-          <w:sz w:val="20"/>
-        </w:rPr>
-        <w:t>pass_to_big_rock_agents</w:t>
-      </w:r>
-      <w:proofErr w:type="spellEnd"/>
-      <w:r>
-        <w:rPr>
-          <w:rFonts w:ascii="Arial" w:hAnsi="Arial"/>
-          <w:sz w:val="20"/>
-        </w:rPr>
-        <w:t xml:space="preserve"> value controls routing. It must be false only when Requirement 1 is false. If Requirement 1 is true, </w:t>
-      </w:r>
-      <w:proofErr w:type="spellStart"/>
-      <w:r>
-        <w:rPr>
-          <w:rFonts w:ascii="Arial" w:hAnsi="Arial"/>
-          <w:sz w:val="20"/>
-        </w:rPr>
-        <w:t>pass_to_big_rock_agents</w:t>
-      </w:r>
-      <w:proofErr w:type="spellEnd"/>
-      <w:r>
-        <w:rPr>
-          <w:rFonts w:ascii="Arial" w:hAnsi="Arial"/>
-          <w:sz w:val="20"/>
-        </w:rPr>
-        <w:t xml:space="preserve"> must be true even if Requirement 2, Requirement 3, or Requirement 4 is triggered.</w:t>
-      </w:r>
-    </w:p>
-    <w:p>
-      <w:r>
-        <w:rPr>
-          <w:rFonts w:ascii="Arial" w:hAnsi="Arial"/>
-          <w:sz w:val="20"/>
-        </w:rPr>
-        <w:lastRenderedPageBreak/>
-        <w:t xml:space="preserve">Requirements 2, 3, and 4 may still return </w:t>
-      </w:r>
-      <w:proofErr w:type="spellStart"/>
-      <w:r>
-        <w:rPr>
-          <w:rFonts w:ascii="Arial" w:hAnsi="Arial"/>
-          <w:sz w:val="20"/>
-        </w:rPr>
-        <w:t>isRisk</w:t>
-      </w:r>
-      <w:proofErr w:type="spellEnd"/>
-      <w:r>
-        <w:rPr>
-          <w:rFonts w:ascii="Arial" w:hAnsi="Arial"/>
-          <w:sz w:val="20"/>
-        </w:rPr>
-        <w:t xml:space="preserve"> = true and show their static display text, but they must not block routing to the Big Rock Agents.</w:t>
+        <w:t>The pass_to_big_rock_agents value controls routing. It must be false only when Requirement 1 is false. If Requirement 1 is true, pass_to_big_rock_agents must be true even if Requirement 2, Requirement 3, or Requirement 4 is triggered.</w:t>
+      </w:r>
+    </w:p>
+    <w:p>
+      <w:r>
+        <w:rPr>
+          <w:rFonts w:ascii="Arial" w:hAnsi="Arial"/>
+          <w:sz w:val="20"/>
+        </w:rPr>
+        <w:t>Requirements 2, 3, and 4 may still return isRisk = true and show their static display text, but they must not block routing to the Big Rock Agents.</w:t>
       </w:r>
     </w:p>
     <w:p>
@@ -2397,107 +2139,16 @@
           <w:rFonts w:ascii="Arial" w:hAnsi="Arial"/>
           <w:sz w:val="20"/>
         </w:rPr>
-        <w:t xml:space="preserve">The output must not include </w:t>
-      </w:r>
-      <w:proofErr w:type="spellStart"/>
-      <w:proofErr w:type="gramStart"/>
-      <w:r>
-        <w:rPr>
-          <w:rFonts w:ascii="Arial" w:hAnsi="Arial"/>
-          <w:sz w:val="20"/>
-        </w:rPr>
-        <w:t>sectionNumber</w:t>
-      </w:r>
-      <w:proofErr w:type="spellEnd"/>
-      <w:proofErr w:type="gramEnd"/>
-      <w:r>
-        <w:rPr>
-          <w:rFonts w:ascii="Arial" w:hAnsi="Arial"/>
-          <w:sz w:val="20"/>
-        </w:rPr>
-        <w:t>.</w:t>
-      </w:r>
-    </w:p>
-    <w:p>
-      <w:proofErr w:type="spellStart"/>
-      <w:r>
-        <w:rPr>
-          <w:rFonts w:ascii="Arial" w:hAnsi="Arial"/>
-          <w:sz w:val="20"/>
-        </w:rPr>
-        <w:t>RiskID</w:t>
-      </w:r>
-      <w:proofErr w:type="spellEnd"/>
-      <w:r>
-        <w:rPr>
-          <w:rFonts w:ascii="Arial" w:hAnsi="Arial"/>
-          <w:sz w:val="20"/>
-        </w:rPr>
-        <w:t xml:space="preserve"> mapping in outputs must </w:t>
-      </w:r>
-      <w:proofErr w:type="gramStart"/>
-      <w:r>
-        <w:rPr>
-          <w:rFonts w:ascii="Arial" w:hAnsi="Arial"/>
-          <w:sz w:val="20"/>
-        </w:rPr>
-        <w:t>be:</w:t>
-      </w:r>
-      <w:proofErr w:type="gramEnd"/>
-      <w:r>
-        <w:rPr>
-          <w:rFonts w:ascii="Arial" w:hAnsi="Arial"/>
-          <w:sz w:val="20"/>
-        </w:rPr>
-        <w:t xml:space="preserve"> Requirement 2 = </w:t>
-      </w:r>
-      <w:proofErr w:type="spellStart"/>
-      <w:r>
-        <w:rPr>
-          <w:rFonts w:ascii="Arial" w:hAnsi="Arial"/>
-          <w:sz w:val="20"/>
-        </w:rPr>
-        <w:t>riskID</w:t>
-      </w:r>
-      <w:proofErr w:type="spellEnd"/>
-      <w:r>
-        <w:rPr>
-          <w:rFonts w:ascii="Arial" w:hAnsi="Arial"/>
-          <w:sz w:val="20"/>
-        </w:rPr>
-        <w:t xml:space="preserve"> 7, Requirement 3 = </w:t>
-      </w:r>
-      <w:proofErr w:type="spellStart"/>
-      <w:r>
-        <w:rPr>
-          <w:rFonts w:ascii="Arial" w:hAnsi="Arial"/>
-          <w:sz w:val="20"/>
-        </w:rPr>
-        <w:t>riskID</w:t>
-      </w:r>
-      <w:proofErr w:type="spellEnd"/>
-      <w:r>
-        <w:rPr>
-          <w:rFonts w:ascii="Arial" w:hAnsi="Arial"/>
-          <w:sz w:val="20"/>
-        </w:rPr>
-        <w:t xml:space="preserve"> 8, Requirement 4 = </w:t>
-      </w:r>
-      <w:proofErr w:type="spellStart"/>
-      <w:r>
-        <w:rPr>
-          <w:rFonts w:ascii="Arial" w:hAnsi="Arial"/>
-          <w:sz w:val="20"/>
-        </w:rPr>
-        <w:t>riskID</w:t>
-      </w:r>
-      <w:proofErr w:type="spellEnd"/>
-      <w:r>
-        <w:rPr>
-          <w:rFonts w:ascii="Arial" w:hAnsi="Arial"/>
-          <w:sz w:val="20"/>
-        </w:rPr>
-        <w:t xml:space="preserve"> 9.</w:t>
+        <w:t>The output must not include sectionNumber.</w:t>
+      </w:r>
+    </w:p>
+    <w:p>
+      <w:r>
+        <w:rPr>
+          <w:rFonts w:ascii="Arial" w:hAnsi="Arial"/>
+          <w:sz w:val="20"/>
+        </w:rPr>
+        <w:t>RiskID mapping in outputs must be: Requirement 2 = riskID 7, Requirement 3 = riskID 8, Requirement 4 = riskID 9.</w:t>
       </w:r>
     </w:p>
     <w:sectPr>
@@ -2665,7 +2316,7 @@
   <w:abstractNum w:abstractNumId="8" w15:restartNumberingAfterBreak="0">
     <w:nsid w:val="FFFFFF89"/>
     <w:multiLevelType w:val="singleLevel"/>
-    <w:tmpl w:val="5EB84504"/>
+    <w:tmpl w:val="8DB61DDC"/>
     <w:lvl w:ilvl="0">
       <w:start w:val="1"/>
       <w:numFmt w:val="bullet"/>
@@ -3420,6 +3071,7 @@
   <w:style w:type="character" w:default="1" w:styleId="DefaultParagraphFont">
     <w:name w:val="Default Paragraph Font"/>
     <w:uiPriority w:val="1"/>
+    <w:semiHidden/>
     <w:unhideWhenUsed/>
   </w:style>
   <w:style w:type="table" w:default="1" w:styleId="TableNormal">

</xml_diff>